<commit_message>
doc: atualizacao das documentacoes pendentes
</commit_message>
<xml_diff>
--- a/ApêndiceA-Planejamento/PID_Cronograma_Projeto.docx
+++ b/ApêndiceA-Planejamento/PID_Cronograma_Projeto.docx
@@ -41,7 +41,7 @@
           </w:tcPr>
           <w:p>
             <w:pPr>
-              <w:pStyle w:val="Heading1"/>
+              <w:pStyle w:val="Ttulo1"/>
               <w:jc w:val="center"/>
               <w:rPr>
                 <w:rFonts w:ascii="Arial" w:hAnsi="Arial" w:cs="Arial"/>
@@ -1652,6 +1652,7 @@
             <w:r>
               <w:rPr>
                 <w:rFonts w:ascii="Arial" w:hAnsi="Arial" w:cs="Arial"/>
+                <w:color w:val="0070C0"/>
                 <w:sz w:val="20"/>
                 <w:szCs w:val="20"/>
               </w:rPr>
@@ -1660,6 +1661,7 @@
             <w:r>
               <w:rPr>
                 <w:rFonts w:ascii="Arial" w:hAnsi="Arial" w:cs="Arial"/>
+                <w:color w:val="0070C0"/>
                 <w:sz w:val="20"/>
                 <w:szCs w:val="20"/>
               </w:rPr>
@@ -2221,18 +2223,11 @@
             <w:r>
               <w:rPr>
                 <w:rFonts w:ascii="Arial" w:hAnsi="Arial" w:cs="Arial"/>
-                <w:sz w:val="20"/>
-                <w:szCs w:val="20"/>
-              </w:rPr>
-              <w:t> </w:t>
-            </w:r>
-            <w:r>
-              <w:rPr>
-                <w:rFonts w:ascii="Arial" w:hAnsi="Arial" w:cs="Arial"/>
-                <w:sz w:val="20"/>
-                <w:szCs w:val="20"/>
-              </w:rPr>
-              <w:t>R</w:t>
+                <w:color w:val="70AD47" w:themeColor="accent6"/>
+                <w:sz w:val="20"/>
+                <w:szCs w:val="20"/>
+              </w:rPr>
+              <w:t> R</w:t>
             </w:r>
           </w:p>
         </w:tc>
@@ -2790,14 +2785,16 @@
             <w:r>
               <w:rPr>
                 <w:rFonts w:ascii="Arial" w:hAnsi="Arial" w:cs="Arial"/>
-                <w:sz w:val="20"/>
-                <w:szCs w:val="20"/>
-              </w:rPr>
-              <w:t> </w:t>
-            </w:r>
-            <w:r>
-              <w:rPr>
-                <w:rFonts w:ascii="Arial" w:hAnsi="Arial" w:cs="Arial"/>
+                <w:color w:val="0070C0"/>
+                <w:sz w:val="20"/>
+                <w:szCs w:val="20"/>
+              </w:rPr>
+              <w:t> </w:t>
+            </w:r>
+            <w:r>
+              <w:rPr>
+                <w:rFonts w:ascii="Arial" w:hAnsi="Arial" w:cs="Arial"/>
+                <w:color w:val="0070C0"/>
                 <w:sz w:val="20"/>
                 <w:szCs w:val="20"/>
               </w:rPr>
@@ -3367,6 +3364,7 @@
             <w:r>
               <w:rPr>
                 <w:rFonts w:ascii="Arial" w:hAnsi="Arial" w:cs="Arial"/>
+                <w:color w:val="70AD47" w:themeColor="accent6"/>
                 <w:sz w:val="20"/>
                 <w:szCs w:val="20"/>
               </w:rPr>
@@ -3898,6 +3896,7 @@
             <w:r>
               <w:rPr>
                 <w:rFonts w:ascii="Arial" w:eastAsia="Arial" w:hAnsi="Arial" w:cs="Arial"/>
+                <w:color w:val="0070C0"/>
                 <w:sz w:val="20"/>
                 <w:szCs w:val="20"/>
               </w:rPr>
@@ -4459,14 +4458,16 @@
             <w:r>
               <w:rPr>
                 <w:rFonts w:ascii="Arial" w:eastAsia="Arial" w:hAnsi="Arial" w:cs="Arial"/>
-                <w:sz w:val="20"/>
-                <w:szCs w:val="20"/>
-              </w:rPr>
-              <w:t> </w:t>
-            </w:r>
-            <w:r>
-              <w:rPr>
-                <w:rFonts w:ascii="Arial" w:eastAsia="Arial" w:hAnsi="Arial" w:cs="Arial"/>
+                <w:color w:val="70AD47" w:themeColor="accent6"/>
+                <w:sz w:val="20"/>
+                <w:szCs w:val="20"/>
+              </w:rPr>
+              <w:t> </w:t>
+            </w:r>
+            <w:r>
+              <w:rPr>
+                <w:rFonts w:ascii="Arial" w:eastAsia="Arial" w:hAnsi="Arial" w:cs="Arial"/>
+                <w:color w:val="70AD47" w:themeColor="accent6"/>
                 <w:sz w:val="20"/>
                 <w:szCs w:val="20"/>
               </w:rPr>
@@ -4904,14 +4905,16 @@
             <w:r>
               <w:rPr>
                 <w:rFonts w:ascii="Arial" w:hAnsi="Arial" w:cs="Arial"/>
-                <w:sz w:val="20"/>
-                <w:szCs w:val="20"/>
-              </w:rPr>
-              <w:t> </w:t>
-            </w:r>
-            <w:r>
-              <w:rPr>
-                <w:rFonts w:ascii="Arial" w:hAnsi="Arial" w:cs="Arial"/>
+                <w:color w:val="0070C0"/>
+                <w:sz w:val="20"/>
+                <w:szCs w:val="20"/>
+              </w:rPr>
+              <w:t> </w:t>
+            </w:r>
+            <w:r>
+              <w:rPr>
+                <w:rFonts w:ascii="Arial" w:hAnsi="Arial" w:cs="Arial"/>
+                <w:color w:val="0070C0"/>
                 <w:sz w:val="20"/>
                 <w:szCs w:val="20"/>
               </w:rPr>
@@ -5514,14 +5517,16 @@
             <w:r>
               <w:rPr>
                 <w:rFonts w:ascii="Arial" w:hAnsi="Arial" w:cs="Arial"/>
-                <w:sz w:val="20"/>
-                <w:szCs w:val="20"/>
-              </w:rPr>
-              <w:t> </w:t>
-            </w:r>
-            <w:r>
-              <w:rPr>
-                <w:rFonts w:ascii="Arial" w:hAnsi="Arial" w:cs="Arial"/>
+                <w:color w:val="70AD47" w:themeColor="accent6"/>
+                <w:sz w:val="20"/>
+                <w:szCs w:val="20"/>
+              </w:rPr>
+              <w:t> </w:t>
+            </w:r>
+            <w:r>
+              <w:rPr>
+                <w:rFonts w:ascii="Arial" w:hAnsi="Arial" w:cs="Arial"/>
+                <w:color w:val="70AD47" w:themeColor="accent6"/>
                 <w:sz w:val="20"/>
                 <w:szCs w:val="20"/>
               </w:rPr>
@@ -6192,6 +6197,7 @@
             <w:r>
               <w:rPr>
                 <w:rFonts w:ascii="Arial" w:hAnsi="Arial" w:cs="Arial"/>
+                <w:color w:val="70AD47" w:themeColor="accent6"/>
                 <w:sz w:val="20"/>
                 <w:szCs w:val="20"/>
               </w:rPr>
@@ -6696,6 +6702,7 @@
             <w:r>
               <w:rPr>
                 <w:rFonts w:ascii="Arial" w:hAnsi="Arial" w:cs="Arial"/>
+                <w:color w:val="0070C0"/>
                 <w:sz w:val="20"/>
                 <w:szCs w:val="20"/>
               </w:rPr>
@@ -7154,14 +7161,16 @@
             <w:r>
               <w:rPr>
                 <w:rFonts w:ascii="Arial" w:hAnsi="Arial" w:cs="Arial"/>
-                <w:sz w:val="20"/>
-                <w:szCs w:val="20"/>
-              </w:rPr>
-              <w:t> </w:t>
-            </w:r>
-            <w:r>
-              <w:rPr>
-                <w:rFonts w:ascii="Arial" w:hAnsi="Arial" w:cs="Arial"/>
+                <w:color w:val="0070C0"/>
+                <w:sz w:val="20"/>
+                <w:szCs w:val="20"/>
+              </w:rPr>
+              <w:t> </w:t>
+            </w:r>
+            <w:r>
+              <w:rPr>
+                <w:rFonts w:ascii="Arial" w:hAnsi="Arial" w:cs="Arial"/>
+                <w:color w:val="0070C0"/>
                 <w:sz w:val="20"/>
                 <w:szCs w:val="20"/>
               </w:rPr>
@@ -7666,6 +7675,7 @@
             <w:r>
               <w:rPr>
                 <w:rFonts w:ascii="Arial" w:hAnsi="Arial" w:cs="Arial"/>
+                <w:color w:val="70AD47" w:themeColor="accent6"/>
                 <w:sz w:val="20"/>
                 <w:szCs w:val="20"/>
               </w:rPr>
@@ -7674,6 +7684,7 @@
             <w:r>
               <w:rPr>
                 <w:rFonts w:ascii="Arial" w:hAnsi="Arial" w:cs="Arial"/>
+                <w:color w:val="70AD47" w:themeColor="accent6"/>
                 <w:sz w:val="20"/>
                 <w:szCs w:val="20"/>
               </w:rPr>
@@ -8179,6 +8190,7 @@
             <w:r>
               <w:rPr>
                 <w:rFonts w:ascii="Arial" w:hAnsi="Arial" w:cs="Arial"/>
+                <w:color w:val="0070C0"/>
                 <w:sz w:val="20"/>
                 <w:szCs w:val="20"/>
               </w:rPr>
@@ -8652,6 +8664,7 @@
             <w:r>
               <w:rPr>
                 <w:rFonts w:ascii="Arial" w:hAnsi="Arial" w:cs="Arial"/>
+                <w:color w:val="70AD47" w:themeColor="accent6"/>
                 <w:sz w:val="20"/>
                 <w:szCs w:val="20"/>
               </w:rPr>
@@ -8854,6 +8867,22 @@
                 <w:szCs w:val="20"/>
               </w:rPr>
             </w:pPr>
+            <w:r>
+              <w:rPr>
+                <w:rFonts w:ascii="Arial" w:eastAsia="Arial" w:hAnsi="Arial" w:cs="Arial"/>
+                <w:sz w:val="20"/>
+                <w:szCs w:val="20"/>
+              </w:rPr>
+              <w:t>Incremento</w:t>
+            </w:r>
+            <w:r>
+              <w:rPr>
+                <w:rFonts w:ascii="Arial" w:eastAsia="Arial" w:hAnsi="Arial" w:cs="Arial"/>
+                <w:sz w:val="20"/>
+                <w:szCs w:val="20"/>
+              </w:rPr>
+              <w:t xml:space="preserve"> 3</w:t>
+            </w:r>
           </w:p>
         </w:tc>
         <w:tc>
@@ -8883,393 +8912,23 @@
                 <w:szCs w:val="20"/>
               </w:rPr>
             </w:pPr>
-          </w:p>
-        </w:tc>
-        <w:tc>
-          <w:tcPr>
-            <w:tcW w:w="630" w:type="dxa"/>
-            <w:tcBorders>
-              <w:top w:val="single" w:sz="4" w:space="0" w:color="000000"/>
-              <w:left w:val="single" w:sz="4" w:space="0" w:color="auto"/>
-              <w:bottom w:val="single" w:sz="4" w:space="0" w:color="000000"/>
-              <w:right w:val="single" w:sz="4" w:space="0" w:color="000000"/>
-            </w:tcBorders>
-            <w:shd w:val="clear" w:color="auto" w:fill="FFFFFF" w:themeFill="background1"/>
-            <w:vAlign w:val="bottom"/>
-          </w:tcPr>
-          <w:p>
-            <w:pPr>
-              <w:spacing w:after="0" w:line="240" w:lineRule="auto"/>
-              <w:rPr>
-                <w:rFonts w:ascii="Arial" w:hAnsi="Arial" w:cs="Arial"/>
-                <w:sz w:val="20"/>
-                <w:szCs w:val="20"/>
-              </w:rPr>
-            </w:pPr>
-          </w:p>
-        </w:tc>
-        <w:tc>
-          <w:tcPr>
-            <w:tcW w:w="630" w:type="dxa"/>
-            <w:tcBorders>
-              <w:top w:val="single" w:sz="4" w:space="0" w:color="000000"/>
-              <w:left w:val="nil"/>
-              <w:bottom w:val="single" w:sz="4" w:space="0" w:color="000000"/>
-              <w:right w:val="single" w:sz="4" w:space="0" w:color="000000"/>
-            </w:tcBorders>
-            <w:shd w:val="clear" w:color="auto" w:fill="FFFFFF" w:themeFill="background1"/>
-            <w:vAlign w:val="bottom"/>
-          </w:tcPr>
-          <w:p>
-            <w:pPr>
-              <w:spacing w:after="0" w:line="240" w:lineRule="auto"/>
-              <w:rPr>
-                <w:rFonts w:ascii="Arial" w:hAnsi="Arial" w:cs="Arial"/>
-                <w:sz w:val="20"/>
-                <w:szCs w:val="20"/>
-              </w:rPr>
-            </w:pPr>
-          </w:p>
-        </w:tc>
-        <w:tc>
-          <w:tcPr>
-            <w:tcW w:w="630" w:type="dxa"/>
-            <w:tcBorders>
-              <w:top w:val="single" w:sz="4" w:space="0" w:color="000000"/>
-              <w:left w:val="nil"/>
-              <w:bottom w:val="single" w:sz="4" w:space="0" w:color="000000"/>
-              <w:right w:val="single" w:sz="4" w:space="0" w:color="000000"/>
-            </w:tcBorders>
-            <w:shd w:val="clear" w:color="auto" w:fill="FFFFFF" w:themeFill="background1"/>
-            <w:vAlign w:val="bottom"/>
-          </w:tcPr>
-          <w:p>
-            <w:pPr>
-              <w:spacing w:after="0" w:line="240" w:lineRule="auto"/>
-              <w:rPr>
-                <w:rFonts w:ascii="Arial" w:hAnsi="Arial" w:cs="Arial"/>
-                <w:sz w:val="20"/>
-                <w:szCs w:val="20"/>
-              </w:rPr>
-            </w:pPr>
-          </w:p>
-        </w:tc>
-        <w:tc>
-          <w:tcPr>
-            <w:tcW w:w="630" w:type="dxa"/>
-            <w:tcBorders>
-              <w:top w:val="single" w:sz="4" w:space="0" w:color="000000"/>
-              <w:left w:val="nil"/>
-              <w:bottom w:val="single" w:sz="4" w:space="0" w:color="000000"/>
-              <w:right w:val="single" w:sz="4" w:space="0" w:color="000000"/>
-            </w:tcBorders>
-            <w:shd w:val="clear" w:color="auto" w:fill="FFFFFF" w:themeFill="background1"/>
-            <w:vAlign w:val="bottom"/>
-          </w:tcPr>
-          <w:p>
-            <w:pPr>
-              <w:spacing w:after="0" w:line="240" w:lineRule="auto"/>
-              <w:rPr>
-                <w:rFonts w:ascii="Arial" w:hAnsi="Arial" w:cs="Arial"/>
-                <w:sz w:val="20"/>
-                <w:szCs w:val="20"/>
-              </w:rPr>
-            </w:pPr>
-          </w:p>
-        </w:tc>
-        <w:tc>
-          <w:tcPr>
-            <w:tcW w:w="630" w:type="dxa"/>
-            <w:tcBorders>
-              <w:top w:val="single" w:sz="4" w:space="0" w:color="000000"/>
-              <w:left w:val="single" w:sz="4" w:space="0" w:color="000000"/>
-              <w:bottom w:val="single" w:sz="4" w:space="0" w:color="000000"/>
-              <w:right w:val="single" w:sz="4" w:space="0" w:color="000000"/>
-            </w:tcBorders>
-            <w:shd w:val="clear" w:color="auto" w:fill="FFFFFF" w:themeFill="background1"/>
-            <w:vAlign w:val="bottom"/>
-          </w:tcPr>
-          <w:p>
-            <w:pPr>
-              <w:spacing w:after="0" w:line="240" w:lineRule="auto"/>
-              <w:rPr>
-                <w:rFonts w:ascii="Arial" w:hAnsi="Arial" w:cs="Arial"/>
-                <w:sz w:val="20"/>
-                <w:szCs w:val="20"/>
-              </w:rPr>
-            </w:pPr>
-          </w:p>
-        </w:tc>
-        <w:tc>
-          <w:tcPr>
-            <w:tcW w:w="630" w:type="dxa"/>
-            <w:tcBorders>
-              <w:top w:val="single" w:sz="4" w:space="0" w:color="000000"/>
-              <w:left w:val="nil"/>
-              <w:bottom w:val="single" w:sz="4" w:space="0" w:color="000000"/>
-              <w:right w:val="single" w:sz="4" w:space="0" w:color="000000"/>
-            </w:tcBorders>
-            <w:shd w:val="clear" w:color="auto" w:fill="FFFFFF" w:themeFill="background1"/>
-            <w:vAlign w:val="bottom"/>
-          </w:tcPr>
-          <w:p>
-            <w:pPr>
-              <w:spacing w:after="0" w:line="240" w:lineRule="auto"/>
-              <w:rPr>
-                <w:rFonts w:ascii="Arial" w:eastAsia="Arial" w:hAnsi="Arial" w:cs="Arial"/>
-                <w:sz w:val="20"/>
-                <w:szCs w:val="20"/>
-              </w:rPr>
-            </w:pPr>
-          </w:p>
-        </w:tc>
-        <w:tc>
-          <w:tcPr>
-            <w:tcW w:w="630" w:type="dxa"/>
-            <w:tcBorders>
-              <w:top w:val="single" w:sz="4" w:space="0" w:color="000000"/>
-              <w:left w:val="nil"/>
-              <w:bottom w:val="single" w:sz="4" w:space="0" w:color="000000"/>
-              <w:right w:val="single" w:sz="4" w:space="0" w:color="000000"/>
-            </w:tcBorders>
-            <w:shd w:val="clear" w:color="auto" w:fill="FFFFFF" w:themeFill="background1"/>
-            <w:vAlign w:val="bottom"/>
-          </w:tcPr>
-          <w:p>
-            <w:pPr>
-              <w:spacing w:after="0" w:line="240" w:lineRule="auto"/>
-              <w:rPr>
-                <w:rFonts w:ascii="Arial" w:eastAsia="Arial" w:hAnsi="Arial" w:cs="Arial"/>
-                <w:sz w:val="20"/>
-                <w:szCs w:val="20"/>
-              </w:rPr>
-            </w:pPr>
-          </w:p>
-        </w:tc>
-        <w:tc>
-          <w:tcPr>
-            <w:tcW w:w="630" w:type="dxa"/>
-            <w:tcBorders>
-              <w:top w:val="single" w:sz="4" w:space="0" w:color="000000"/>
-              <w:left w:val="nil"/>
-              <w:bottom w:val="single" w:sz="4" w:space="0" w:color="000000"/>
-              <w:right w:val="single" w:sz="4" w:space="0" w:color="000000"/>
-            </w:tcBorders>
-            <w:shd w:val="clear" w:color="auto" w:fill="FFFFFF" w:themeFill="background1"/>
-            <w:vAlign w:val="bottom"/>
-          </w:tcPr>
-          <w:p>
-            <w:pPr>
-              <w:spacing w:after="0" w:line="240" w:lineRule="auto"/>
-              <w:rPr>
-                <w:rFonts w:ascii="Arial" w:hAnsi="Arial" w:cs="Arial"/>
-                <w:sz w:val="20"/>
-                <w:szCs w:val="20"/>
-              </w:rPr>
-            </w:pPr>
-          </w:p>
-        </w:tc>
-        <w:tc>
-          <w:tcPr>
-            <w:tcW w:w="630" w:type="dxa"/>
-            <w:tcBorders>
-              <w:top w:val="single" w:sz="4" w:space="0" w:color="000000"/>
-              <w:left w:val="nil"/>
-              <w:bottom w:val="single" w:sz="4" w:space="0" w:color="000000"/>
-              <w:right w:val="single" w:sz="4" w:space="0" w:color="000000"/>
-            </w:tcBorders>
-            <w:shd w:val="clear" w:color="auto" w:fill="FFFFFF" w:themeFill="background1"/>
-            <w:vAlign w:val="bottom"/>
-          </w:tcPr>
-          <w:p>
-            <w:pPr>
-              <w:spacing w:after="0" w:line="240" w:lineRule="auto"/>
-              <w:rPr>
-                <w:rFonts w:ascii="Arial" w:hAnsi="Arial" w:cs="Arial"/>
-                <w:sz w:val="20"/>
-                <w:szCs w:val="20"/>
-              </w:rPr>
-            </w:pPr>
-          </w:p>
-        </w:tc>
-        <w:tc>
-          <w:tcPr>
-            <w:tcW w:w="630" w:type="dxa"/>
-            <w:tcBorders>
-              <w:top w:val="single" w:sz="4" w:space="0" w:color="000000"/>
-              <w:left w:val="nil"/>
-              <w:bottom w:val="single" w:sz="4" w:space="0" w:color="000000"/>
-              <w:right w:val="single" w:sz="4" w:space="0" w:color="000000"/>
-            </w:tcBorders>
-            <w:shd w:val="clear" w:color="auto" w:fill="FFFFFF" w:themeFill="background1"/>
-            <w:vAlign w:val="bottom"/>
-          </w:tcPr>
-          <w:p>
-            <w:pPr>
-              <w:spacing w:after="0" w:line="240" w:lineRule="auto"/>
-              <w:rPr>
-                <w:rFonts w:ascii="Arial" w:hAnsi="Arial" w:cs="Arial"/>
-                <w:sz w:val="20"/>
-                <w:szCs w:val="20"/>
-              </w:rPr>
-            </w:pPr>
-          </w:p>
-        </w:tc>
-        <w:tc>
-          <w:tcPr>
-            <w:tcW w:w="630" w:type="dxa"/>
-            <w:tcBorders>
-              <w:top w:val="single" w:sz="4" w:space="0" w:color="000000"/>
-              <w:left w:val="nil"/>
-              <w:bottom w:val="single" w:sz="4" w:space="0" w:color="000000"/>
-              <w:right w:val="single" w:sz="4" w:space="0" w:color="000000"/>
-            </w:tcBorders>
-            <w:shd w:val="clear" w:color="auto" w:fill="FFFFFF" w:themeFill="background1"/>
-            <w:vAlign w:val="bottom"/>
-          </w:tcPr>
-          <w:p>
-            <w:pPr>
-              <w:spacing w:after="0" w:line="240" w:lineRule="auto"/>
-              <w:rPr>
-                <w:rFonts w:ascii="Arial" w:hAnsi="Arial" w:cs="Arial"/>
-                <w:sz w:val="20"/>
-                <w:szCs w:val="20"/>
-              </w:rPr>
-            </w:pPr>
-          </w:p>
-        </w:tc>
-        <w:tc>
-          <w:tcPr>
-            <w:tcW w:w="630" w:type="dxa"/>
-            <w:tcBorders>
-              <w:top w:val="single" w:sz="4" w:space="0" w:color="000000"/>
-              <w:left w:val="nil"/>
-              <w:bottom w:val="single" w:sz="4" w:space="0" w:color="000000"/>
-              <w:right w:val="single" w:sz="4" w:space="0" w:color="000000"/>
-            </w:tcBorders>
-            <w:shd w:val="clear" w:color="auto" w:fill="FFFFFF" w:themeFill="background1"/>
-            <w:vAlign w:val="bottom"/>
-          </w:tcPr>
-          <w:p>
-            <w:pPr>
-              <w:spacing w:after="0" w:line="240" w:lineRule="auto"/>
-              <w:rPr>
-                <w:rFonts w:ascii="Arial" w:hAnsi="Arial" w:cs="Arial"/>
-                <w:color w:val="0070C0"/>
-                <w:sz w:val="20"/>
-                <w:szCs w:val="20"/>
-              </w:rPr>
-            </w:pPr>
-          </w:p>
-        </w:tc>
-        <w:tc>
-          <w:tcPr>
-            <w:tcW w:w="630" w:type="dxa"/>
-            <w:tcBorders>
-              <w:top w:val="single" w:sz="4" w:space="0" w:color="000000"/>
-              <w:left w:val="nil"/>
-              <w:bottom w:val="single" w:sz="4" w:space="0" w:color="000000"/>
-              <w:right w:val="single" w:sz="4" w:space="0" w:color="000000"/>
-            </w:tcBorders>
-            <w:shd w:val="clear" w:color="auto" w:fill="FFFFFF" w:themeFill="background1"/>
-            <w:vAlign w:val="bottom"/>
-          </w:tcPr>
-          <w:p>
-            <w:pPr>
-              <w:spacing w:after="0" w:line="240" w:lineRule="auto"/>
-              <w:rPr>
-                <w:rFonts w:ascii="Arial" w:hAnsi="Arial" w:cs="Arial"/>
-                <w:color w:val="0070C0"/>
-                <w:sz w:val="20"/>
-                <w:szCs w:val="20"/>
-              </w:rPr>
-            </w:pPr>
-          </w:p>
-        </w:tc>
-        <w:tc>
-          <w:tcPr>
-            <w:tcW w:w="630" w:type="dxa"/>
-            <w:tcBorders>
-              <w:top w:val="single" w:sz="4" w:space="0" w:color="000000"/>
-              <w:left w:val="nil"/>
-              <w:bottom w:val="single" w:sz="4" w:space="0" w:color="000000"/>
-              <w:right w:val="single" w:sz="4" w:space="0" w:color="000000"/>
-            </w:tcBorders>
-            <w:shd w:val="clear" w:color="auto" w:fill="FFFFFF" w:themeFill="background1"/>
-            <w:vAlign w:val="bottom"/>
-          </w:tcPr>
-          <w:p>
-            <w:pPr>
-              <w:spacing w:after="0" w:line="240" w:lineRule="auto"/>
-              <w:rPr>
-                <w:rFonts w:ascii="Arial" w:hAnsi="Arial" w:cs="Arial"/>
-                <w:sz w:val="20"/>
-                <w:szCs w:val="20"/>
-              </w:rPr>
-            </w:pPr>
-          </w:p>
-        </w:tc>
-        <w:tc>
-          <w:tcPr>
-            <w:tcW w:w="630" w:type="dxa"/>
-            <w:tcBorders>
-              <w:top w:val="single" w:sz="4" w:space="0" w:color="000000"/>
-              <w:left w:val="nil"/>
-              <w:bottom w:val="single" w:sz="4" w:space="0" w:color="000000"/>
-              <w:right w:val="single" w:sz="4" w:space="0" w:color="000000"/>
-            </w:tcBorders>
-            <w:shd w:val="clear" w:color="auto" w:fill="FFFFFF" w:themeFill="background1"/>
-            <w:vAlign w:val="bottom"/>
-          </w:tcPr>
-          <w:p>
-            <w:pPr>
-              <w:spacing w:after="0" w:line="240" w:lineRule="auto"/>
-              <w:rPr>
-                <w:rFonts w:ascii="Arial" w:eastAsia="Arial" w:hAnsi="Arial" w:cs="Arial"/>
-                <w:sz w:val="20"/>
-                <w:szCs w:val="20"/>
-              </w:rPr>
-            </w:pPr>
-          </w:p>
-        </w:tc>
-        <w:tc>
-          <w:tcPr>
-            <w:tcW w:w="630" w:type="dxa"/>
-            <w:tcBorders>
-              <w:top w:val="single" w:sz="4" w:space="0" w:color="000000"/>
-              <w:left w:val="nil"/>
-              <w:bottom w:val="single" w:sz="4" w:space="0" w:color="000000"/>
-              <w:right w:val="single" w:sz="4" w:space="0" w:color="000000"/>
-            </w:tcBorders>
-            <w:shd w:val="clear" w:color="auto" w:fill="FFFFFF" w:themeFill="background1"/>
-            <w:vAlign w:val="bottom"/>
-          </w:tcPr>
-          <w:p>
-            <w:pPr>
-              <w:spacing w:after="0" w:line="240" w:lineRule="auto"/>
-              <w:rPr>
-                <w:rFonts w:ascii="Arial" w:eastAsia="Arial" w:hAnsi="Arial" w:cs="Arial"/>
-                <w:sz w:val="20"/>
-                <w:szCs w:val="20"/>
-              </w:rPr>
-            </w:pPr>
-          </w:p>
-        </w:tc>
-      </w:tr>
-      <w:tr>
-        <w:trPr>
-          <w:trHeight w:val="255"/>
-        </w:trPr>
-        <w:tc>
-          <w:tcPr>
-            <w:tcW w:w="1530" w:type="dxa"/>
-            <w:tcBorders>
-              <w:top w:val="single" w:sz="4" w:space="0" w:color="auto"/>
-              <w:left w:val="single" w:sz="4" w:space="0" w:color="auto"/>
-              <w:bottom w:val="single" w:sz="4" w:space="0" w:color="auto"/>
-              <w:right w:val="single" w:sz="4" w:space="0" w:color="auto"/>
-            </w:tcBorders>
-          </w:tcPr>
+            <w:r>
+              <w:rPr>
+                <w:rFonts w:ascii="Arial" w:eastAsia="Arial" w:hAnsi="Arial" w:cs="Arial"/>
+                <w:sz w:val="20"/>
+                <w:szCs w:val="20"/>
+              </w:rPr>
+              <w:t>E</w:t>
+            </w:r>
+            <w:r>
+              <w:rPr>
+                <w:rFonts w:ascii="Arial" w:eastAsia="Arial" w:hAnsi="Arial" w:cs="Arial"/>
+                <w:sz w:val="20"/>
+                <w:szCs w:val="20"/>
+              </w:rPr>
+              <w:t>specificação dos Requisitos</w:t>
+            </w:r>
+          </w:p>
           <w:p>
             <w:pPr>
               <w:widowControl w:val="0"/>
@@ -9287,18 +8946,15 @@
                 <w:szCs w:val="20"/>
               </w:rPr>
             </w:pPr>
-          </w:p>
-        </w:tc>
-        <w:tc>
-          <w:tcPr>
-            <w:tcW w:w="3118" w:type="dxa"/>
-            <w:tcBorders>
-              <w:top w:val="single" w:sz="4" w:space="0" w:color="auto"/>
-              <w:left w:val="single" w:sz="4" w:space="0" w:color="auto"/>
-              <w:bottom w:val="single" w:sz="4" w:space="0" w:color="auto"/>
-              <w:right w:val="single" w:sz="4" w:space="0" w:color="auto"/>
-            </w:tcBorders>
-          </w:tcPr>
+            <w:r>
+              <w:rPr>
+                <w:rFonts w:ascii="Arial" w:eastAsia="Arial" w:hAnsi="Arial" w:cs="Arial"/>
+                <w:sz w:val="20"/>
+                <w:szCs w:val="20"/>
+              </w:rPr>
+              <w:t xml:space="preserve">Requisitos não funcionais. Análise dos requisitos </w:t>
+            </w:r>
+          </w:p>
           <w:p>
             <w:pPr>
               <w:widowControl w:val="0"/>
@@ -9316,6 +8972,14 @@
                 <w:szCs w:val="20"/>
               </w:rPr>
             </w:pPr>
+            <w:r>
+              <w:rPr>
+                <w:rFonts w:ascii="Arial" w:eastAsia="Arial" w:hAnsi="Arial" w:cs="Arial"/>
+                <w:sz w:val="20"/>
+                <w:szCs w:val="20"/>
+              </w:rPr>
+              <w:t>Análise dos requisitos</w:t>
+            </w:r>
           </w:p>
         </w:tc>
         <w:tc>
@@ -9523,52 +9187,70 @@
                 <w:szCs w:val="20"/>
               </w:rPr>
             </w:pPr>
-          </w:p>
-        </w:tc>
-        <w:tc>
-          <w:tcPr>
-            <w:tcW w:w="630" w:type="dxa"/>
-            <w:tcBorders>
-              <w:top w:val="single" w:sz="4" w:space="0" w:color="000000"/>
-              <w:left w:val="nil"/>
-              <w:bottom w:val="single" w:sz="4" w:space="0" w:color="000000"/>
-              <w:right w:val="single" w:sz="4" w:space="0" w:color="000000"/>
-            </w:tcBorders>
-            <w:shd w:val="clear" w:color="auto" w:fill="FFFFFF" w:themeFill="background1"/>
-            <w:vAlign w:val="bottom"/>
-          </w:tcPr>
-          <w:p>
-            <w:pPr>
-              <w:spacing w:after="0" w:line="240" w:lineRule="auto"/>
-              <w:rPr>
-                <w:rFonts w:ascii="Arial" w:hAnsi="Arial" w:cs="Arial"/>
-                <w:sz w:val="20"/>
-                <w:szCs w:val="20"/>
-              </w:rPr>
-            </w:pPr>
-          </w:p>
-        </w:tc>
-        <w:tc>
-          <w:tcPr>
-            <w:tcW w:w="630" w:type="dxa"/>
-            <w:tcBorders>
-              <w:top w:val="single" w:sz="4" w:space="0" w:color="000000"/>
-              <w:left w:val="nil"/>
-              <w:bottom w:val="single" w:sz="4" w:space="0" w:color="000000"/>
-              <w:right w:val="single" w:sz="4" w:space="0" w:color="000000"/>
-            </w:tcBorders>
-            <w:shd w:val="clear" w:color="auto" w:fill="FFFFFF" w:themeFill="background1"/>
-            <w:vAlign w:val="bottom"/>
-          </w:tcPr>
-          <w:p>
-            <w:pPr>
-              <w:spacing w:after="0" w:line="240" w:lineRule="auto"/>
-              <w:rPr>
-                <w:rFonts w:ascii="Arial" w:hAnsi="Arial" w:cs="Arial"/>
-                <w:sz w:val="20"/>
-                <w:szCs w:val="20"/>
-              </w:rPr>
-            </w:pPr>
+            <w:r>
+              <w:rPr>
+                <w:rFonts w:ascii="Arial" w:hAnsi="Arial" w:cs="Arial"/>
+                <w:color w:val="0070C0"/>
+                <w:sz w:val="20"/>
+                <w:szCs w:val="20"/>
+              </w:rPr>
+              <w:t>P</w:t>
+            </w:r>
+          </w:p>
+        </w:tc>
+        <w:tc>
+          <w:tcPr>
+            <w:tcW w:w="630" w:type="dxa"/>
+            <w:tcBorders>
+              <w:top w:val="single" w:sz="4" w:space="0" w:color="000000"/>
+              <w:left w:val="nil"/>
+              <w:bottom w:val="single" w:sz="4" w:space="0" w:color="000000"/>
+              <w:right w:val="single" w:sz="4" w:space="0" w:color="000000"/>
+            </w:tcBorders>
+            <w:shd w:val="clear" w:color="auto" w:fill="FFFFFF" w:themeFill="background1"/>
+            <w:vAlign w:val="bottom"/>
+          </w:tcPr>
+          <w:p>
+            <w:pPr>
+              <w:spacing w:after="0" w:line="240" w:lineRule="auto"/>
+              <w:rPr>
+                <w:rFonts w:ascii="Arial" w:hAnsi="Arial" w:cs="Arial"/>
+                <w:sz w:val="20"/>
+                <w:szCs w:val="20"/>
+              </w:rPr>
+            </w:pPr>
+          </w:p>
+        </w:tc>
+        <w:tc>
+          <w:tcPr>
+            <w:tcW w:w="630" w:type="dxa"/>
+            <w:tcBorders>
+              <w:top w:val="single" w:sz="4" w:space="0" w:color="000000"/>
+              <w:left w:val="nil"/>
+              <w:bottom w:val="single" w:sz="4" w:space="0" w:color="000000"/>
+              <w:right w:val="single" w:sz="4" w:space="0" w:color="000000"/>
+            </w:tcBorders>
+            <w:shd w:val="clear" w:color="auto" w:fill="FFFFFF" w:themeFill="background1"/>
+            <w:vAlign w:val="bottom"/>
+          </w:tcPr>
+          <w:p>
+            <w:pPr>
+              <w:spacing w:after="0" w:line="240" w:lineRule="auto"/>
+              <w:rPr>
+                <w:rFonts w:ascii="Arial" w:hAnsi="Arial" w:cs="Arial"/>
+                <w:sz w:val="20"/>
+                <w:szCs w:val="20"/>
+              </w:rPr>
+            </w:pPr>
+            <w:r>
+              <w:rPr>
+                <w:rFonts w:ascii="Arial" w:hAnsi="Arial" w:cs="Arial"/>
+                <w:color w:val="70AD47" w:themeColor="accent6"/>
+                <w:sz w:val="20"/>
+                <w:szCs w:val="20"/>
+              </w:rPr>
+              <w:t>R</w:t>
+            </w:r>
           </w:p>
         </w:tc>
         <w:tc>
@@ -9720,6 +9402,22 @@
                 <w:szCs w:val="20"/>
               </w:rPr>
             </w:pPr>
+            <w:r>
+              <w:rPr>
+                <w:rFonts w:ascii="Arial" w:eastAsia="Arial" w:hAnsi="Arial" w:cs="Arial"/>
+                <w:sz w:val="20"/>
+                <w:szCs w:val="20"/>
+              </w:rPr>
+              <w:t>Incremento</w:t>
+            </w:r>
+            <w:r>
+              <w:rPr>
+                <w:rFonts w:ascii="Arial" w:eastAsia="Arial" w:hAnsi="Arial" w:cs="Arial"/>
+                <w:sz w:val="20"/>
+                <w:szCs w:val="20"/>
+              </w:rPr>
+              <w:t xml:space="preserve"> 4</w:t>
+            </w:r>
           </w:p>
         </w:tc>
         <w:tc>
@@ -9749,6 +9447,23 @@
                 <w:szCs w:val="20"/>
               </w:rPr>
             </w:pPr>
+            <w:r>
+              <w:rPr>
+                <w:rFonts w:ascii="Arial" w:eastAsia="Arial" w:hAnsi="Arial" w:cs="Arial"/>
+                <w:sz w:val="20"/>
+                <w:szCs w:val="20"/>
+              </w:rPr>
+              <w:t xml:space="preserve">Especificação dos Requisitos Análise dos requisitos - visão </w:t>
+            </w:r>
+            <w:r>
+              <w:rPr>
+                <w:rFonts w:ascii="Arial" w:eastAsia="Arial" w:hAnsi="Arial" w:cs="Arial"/>
+                <w:sz w:val="20"/>
+                <w:szCs w:val="20"/>
+              </w:rPr>
+              <w:lastRenderedPageBreak/>
+              <w:t>comportamental</w:t>
+            </w:r>
           </w:p>
         </w:tc>
         <w:tc>
@@ -10026,53 +9741,71 @@
                 <w:szCs w:val="20"/>
               </w:rPr>
             </w:pPr>
-          </w:p>
-        </w:tc>
-        <w:tc>
-          <w:tcPr>
-            <w:tcW w:w="630" w:type="dxa"/>
-            <w:tcBorders>
-              <w:top w:val="single" w:sz="4" w:space="0" w:color="000000"/>
-              <w:left w:val="nil"/>
-              <w:bottom w:val="single" w:sz="4" w:space="0" w:color="000000"/>
-              <w:right w:val="single" w:sz="4" w:space="0" w:color="000000"/>
-            </w:tcBorders>
-            <w:shd w:val="clear" w:color="auto" w:fill="FFFFFF" w:themeFill="background1"/>
-            <w:vAlign w:val="bottom"/>
-          </w:tcPr>
-          <w:p>
-            <w:pPr>
-              <w:spacing w:after="0" w:line="240" w:lineRule="auto"/>
+            <w:r>
               <w:rPr>
                 <w:rFonts w:ascii="Arial" w:hAnsi="Arial" w:cs="Arial"/>
                 <w:color w:val="0070C0"/>
                 <w:sz w:val="20"/>
                 <w:szCs w:val="20"/>
               </w:rPr>
-            </w:pPr>
-          </w:p>
-        </w:tc>
-        <w:tc>
-          <w:tcPr>
-            <w:tcW w:w="630" w:type="dxa"/>
-            <w:tcBorders>
-              <w:top w:val="single" w:sz="4" w:space="0" w:color="000000"/>
-              <w:left w:val="nil"/>
-              <w:bottom w:val="single" w:sz="4" w:space="0" w:color="000000"/>
-              <w:right w:val="single" w:sz="4" w:space="0" w:color="000000"/>
-            </w:tcBorders>
-            <w:shd w:val="clear" w:color="auto" w:fill="FFFFFF" w:themeFill="background1"/>
-            <w:vAlign w:val="bottom"/>
-          </w:tcPr>
-          <w:p>
-            <w:pPr>
-              <w:spacing w:after="0" w:line="240" w:lineRule="auto"/>
-              <w:rPr>
-                <w:rFonts w:ascii="Arial" w:hAnsi="Arial" w:cs="Arial"/>
-                <w:sz w:val="20"/>
-                <w:szCs w:val="20"/>
-              </w:rPr>
-            </w:pPr>
+              <w:t>P</w:t>
+            </w:r>
+          </w:p>
+        </w:tc>
+        <w:tc>
+          <w:tcPr>
+            <w:tcW w:w="630" w:type="dxa"/>
+            <w:tcBorders>
+              <w:top w:val="single" w:sz="4" w:space="0" w:color="000000"/>
+              <w:left w:val="nil"/>
+              <w:bottom w:val="single" w:sz="4" w:space="0" w:color="000000"/>
+              <w:right w:val="single" w:sz="4" w:space="0" w:color="000000"/>
+            </w:tcBorders>
+            <w:shd w:val="clear" w:color="auto" w:fill="FFFFFF" w:themeFill="background1"/>
+            <w:vAlign w:val="bottom"/>
+          </w:tcPr>
+          <w:p>
+            <w:pPr>
+              <w:spacing w:after="0" w:line="240" w:lineRule="auto"/>
+              <w:rPr>
+                <w:rFonts w:ascii="Arial" w:hAnsi="Arial" w:cs="Arial"/>
+                <w:color w:val="0070C0"/>
+                <w:sz w:val="20"/>
+                <w:szCs w:val="20"/>
+              </w:rPr>
+            </w:pPr>
+          </w:p>
+        </w:tc>
+        <w:tc>
+          <w:tcPr>
+            <w:tcW w:w="630" w:type="dxa"/>
+            <w:tcBorders>
+              <w:top w:val="single" w:sz="4" w:space="0" w:color="000000"/>
+              <w:left w:val="nil"/>
+              <w:bottom w:val="single" w:sz="4" w:space="0" w:color="000000"/>
+              <w:right w:val="single" w:sz="4" w:space="0" w:color="000000"/>
+            </w:tcBorders>
+            <w:shd w:val="clear" w:color="auto" w:fill="FFFFFF" w:themeFill="background1"/>
+            <w:vAlign w:val="bottom"/>
+          </w:tcPr>
+          <w:p>
+            <w:pPr>
+              <w:spacing w:after="0" w:line="240" w:lineRule="auto"/>
+              <w:rPr>
+                <w:rFonts w:ascii="Arial" w:hAnsi="Arial" w:cs="Arial"/>
+                <w:sz w:val="20"/>
+                <w:szCs w:val="20"/>
+              </w:rPr>
+            </w:pPr>
+            <w:r>
+              <w:rPr>
+                <w:rFonts w:ascii="Arial" w:hAnsi="Arial" w:cs="Arial"/>
+                <w:color w:val="70AD47" w:themeColor="accent6"/>
+                <w:sz w:val="20"/>
+                <w:szCs w:val="20"/>
+              </w:rPr>
+              <w:t>R</w:t>
+            </w:r>
           </w:p>
         </w:tc>
         <w:tc>
@@ -11421,7 +11154,448 @@
           </w:p>
         </w:tc>
       </w:tr>
+      <w:tr>
+        <w:trPr>
+          <w:trHeight w:val="255"/>
+        </w:trPr>
+        <w:tc>
+          <w:tcPr>
+            <w:tcW w:w="1530" w:type="dxa"/>
+            <w:tcBorders>
+              <w:top w:val="single" w:sz="4" w:space="0" w:color="auto"/>
+              <w:left w:val="single" w:sz="4" w:space="0" w:color="auto"/>
+              <w:bottom w:val="single" w:sz="4" w:space="0" w:color="auto"/>
+              <w:right w:val="single" w:sz="4" w:space="0" w:color="auto"/>
+            </w:tcBorders>
+          </w:tcPr>
+          <w:p>
+            <w:pPr>
+              <w:widowControl w:val="0"/>
+              <w:pBdr>
+                <w:top w:val="nil"/>
+                <w:left w:val="nil"/>
+                <w:bottom w:val="nil"/>
+                <w:right w:val="nil"/>
+                <w:between w:val="nil"/>
+              </w:pBdr>
+              <w:spacing w:after="0" w:line="240" w:lineRule="auto"/>
+              <w:rPr>
+                <w:rFonts w:ascii="Arial" w:eastAsia="Arial" w:hAnsi="Arial" w:cs="Arial"/>
+                <w:sz w:val="20"/>
+                <w:szCs w:val="20"/>
+              </w:rPr>
+            </w:pPr>
+          </w:p>
+        </w:tc>
+        <w:tc>
+          <w:tcPr>
+            <w:tcW w:w="3118" w:type="dxa"/>
+            <w:tcBorders>
+              <w:top w:val="single" w:sz="4" w:space="0" w:color="auto"/>
+              <w:left w:val="single" w:sz="4" w:space="0" w:color="auto"/>
+              <w:bottom w:val="single" w:sz="4" w:space="0" w:color="auto"/>
+              <w:right w:val="single" w:sz="4" w:space="0" w:color="auto"/>
+            </w:tcBorders>
+          </w:tcPr>
+          <w:p>
+            <w:pPr>
+              <w:widowControl w:val="0"/>
+              <w:pBdr>
+                <w:top w:val="nil"/>
+                <w:left w:val="nil"/>
+                <w:bottom w:val="nil"/>
+                <w:right w:val="nil"/>
+                <w:between w:val="nil"/>
+              </w:pBdr>
+              <w:spacing w:after="0" w:line="240" w:lineRule="auto"/>
+              <w:rPr>
+                <w:rFonts w:ascii="Arial" w:eastAsia="Arial" w:hAnsi="Arial" w:cs="Arial"/>
+                <w:sz w:val="20"/>
+                <w:szCs w:val="20"/>
+              </w:rPr>
+            </w:pPr>
+          </w:p>
+        </w:tc>
+        <w:tc>
+          <w:tcPr>
+            <w:tcW w:w="630" w:type="dxa"/>
+            <w:tcBorders>
+              <w:top w:val="single" w:sz="4" w:space="0" w:color="000000"/>
+              <w:left w:val="single" w:sz="4" w:space="0" w:color="auto"/>
+              <w:bottom w:val="single" w:sz="4" w:space="0" w:color="000000"/>
+              <w:right w:val="single" w:sz="4" w:space="0" w:color="000000"/>
+            </w:tcBorders>
+            <w:shd w:val="clear" w:color="auto" w:fill="FFFFFF" w:themeFill="background1"/>
+            <w:vAlign w:val="bottom"/>
+          </w:tcPr>
+          <w:p>
+            <w:pPr>
+              <w:spacing w:after="0" w:line="240" w:lineRule="auto"/>
+              <w:rPr>
+                <w:rFonts w:ascii="Arial" w:hAnsi="Arial" w:cs="Arial"/>
+                <w:sz w:val="20"/>
+                <w:szCs w:val="20"/>
+              </w:rPr>
+            </w:pPr>
+          </w:p>
+        </w:tc>
+        <w:tc>
+          <w:tcPr>
+            <w:tcW w:w="630" w:type="dxa"/>
+            <w:tcBorders>
+              <w:top w:val="single" w:sz="4" w:space="0" w:color="000000"/>
+              <w:left w:val="nil"/>
+              <w:bottom w:val="single" w:sz="4" w:space="0" w:color="000000"/>
+              <w:right w:val="single" w:sz="4" w:space="0" w:color="000000"/>
+            </w:tcBorders>
+            <w:shd w:val="clear" w:color="auto" w:fill="FFFFFF" w:themeFill="background1"/>
+            <w:vAlign w:val="bottom"/>
+          </w:tcPr>
+          <w:p>
+            <w:pPr>
+              <w:spacing w:after="0" w:line="240" w:lineRule="auto"/>
+              <w:rPr>
+                <w:rFonts w:ascii="Arial" w:hAnsi="Arial" w:cs="Arial"/>
+                <w:sz w:val="20"/>
+                <w:szCs w:val="20"/>
+              </w:rPr>
+            </w:pPr>
+          </w:p>
+        </w:tc>
+        <w:tc>
+          <w:tcPr>
+            <w:tcW w:w="630" w:type="dxa"/>
+            <w:tcBorders>
+              <w:top w:val="single" w:sz="4" w:space="0" w:color="000000"/>
+              <w:left w:val="nil"/>
+              <w:bottom w:val="single" w:sz="4" w:space="0" w:color="000000"/>
+              <w:right w:val="single" w:sz="4" w:space="0" w:color="000000"/>
+            </w:tcBorders>
+            <w:shd w:val="clear" w:color="auto" w:fill="FFFFFF" w:themeFill="background1"/>
+            <w:vAlign w:val="bottom"/>
+          </w:tcPr>
+          <w:p>
+            <w:pPr>
+              <w:spacing w:after="0" w:line="240" w:lineRule="auto"/>
+              <w:rPr>
+                <w:rFonts w:ascii="Arial" w:hAnsi="Arial" w:cs="Arial"/>
+                <w:sz w:val="20"/>
+                <w:szCs w:val="20"/>
+              </w:rPr>
+            </w:pPr>
+          </w:p>
+        </w:tc>
+        <w:tc>
+          <w:tcPr>
+            <w:tcW w:w="630" w:type="dxa"/>
+            <w:tcBorders>
+              <w:top w:val="single" w:sz="4" w:space="0" w:color="000000"/>
+              <w:left w:val="nil"/>
+              <w:bottom w:val="single" w:sz="4" w:space="0" w:color="000000"/>
+              <w:right w:val="single" w:sz="4" w:space="0" w:color="000000"/>
+            </w:tcBorders>
+            <w:shd w:val="clear" w:color="auto" w:fill="FFFFFF" w:themeFill="background1"/>
+            <w:vAlign w:val="bottom"/>
+          </w:tcPr>
+          <w:p>
+            <w:pPr>
+              <w:spacing w:after="0" w:line="240" w:lineRule="auto"/>
+              <w:rPr>
+                <w:rFonts w:ascii="Arial" w:hAnsi="Arial" w:cs="Arial"/>
+                <w:sz w:val="20"/>
+                <w:szCs w:val="20"/>
+              </w:rPr>
+            </w:pPr>
+          </w:p>
+        </w:tc>
+        <w:tc>
+          <w:tcPr>
+            <w:tcW w:w="630" w:type="dxa"/>
+            <w:tcBorders>
+              <w:top w:val="single" w:sz="4" w:space="0" w:color="000000"/>
+              <w:left w:val="single" w:sz="4" w:space="0" w:color="000000"/>
+              <w:bottom w:val="single" w:sz="4" w:space="0" w:color="000000"/>
+              <w:right w:val="single" w:sz="4" w:space="0" w:color="000000"/>
+            </w:tcBorders>
+            <w:shd w:val="clear" w:color="auto" w:fill="FFFFFF" w:themeFill="background1"/>
+            <w:vAlign w:val="bottom"/>
+          </w:tcPr>
+          <w:p>
+            <w:pPr>
+              <w:spacing w:after="0" w:line="240" w:lineRule="auto"/>
+              <w:rPr>
+                <w:rFonts w:ascii="Arial" w:hAnsi="Arial" w:cs="Arial"/>
+                <w:sz w:val="20"/>
+                <w:szCs w:val="20"/>
+              </w:rPr>
+            </w:pPr>
+          </w:p>
+        </w:tc>
+        <w:tc>
+          <w:tcPr>
+            <w:tcW w:w="630" w:type="dxa"/>
+            <w:tcBorders>
+              <w:top w:val="single" w:sz="4" w:space="0" w:color="000000"/>
+              <w:left w:val="nil"/>
+              <w:bottom w:val="single" w:sz="4" w:space="0" w:color="000000"/>
+              <w:right w:val="single" w:sz="4" w:space="0" w:color="000000"/>
+            </w:tcBorders>
+            <w:shd w:val="clear" w:color="auto" w:fill="FFFFFF" w:themeFill="background1"/>
+            <w:vAlign w:val="bottom"/>
+          </w:tcPr>
+          <w:p>
+            <w:pPr>
+              <w:spacing w:after="0" w:line="240" w:lineRule="auto"/>
+              <w:rPr>
+                <w:rFonts w:ascii="Arial" w:eastAsia="Arial" w:hAnsi="Arial" w:cs="Arial"/>
+                <w:sz w:val="20"/>
+                <w:szCs w:val="20"/>
+              </w:rPr>
+            </w:pPr>
+          </w:p>
+        </w:tc>
+        <w:tc>
+          <w:tcPr>
+            <w:tcW w:w="630" w:type="dxa"/>
+            <w:tcBorders>
+              <w:top w:val="single" w:sz="4" w:space="0" w:color="000000"/>
+              <w:left w:val="nil"/>
+              <w:bottom w:val="single" w:sz="4" w:space="0" w:color="000000"/>
+              <w:right w:val="single" w:sz="4" w:space="0" w:color="000000"/>
+            </w:tcBorders>
+            <w:shd w:val="clear" w:color="auto" w:fill="FFFFFF" w:themeFill="background1"/>
+            <w:vAlign w:val="bottom"/>
+          </w:tcPr>
+          <w:p>
+            <w:pPr>
+              <w:spacing w:after="0" w:line="240" w:lineRule="auto"/>
+              <w:rPr>
+                <w:rFonts w:ascii="Arial" w:eastAsia="Arial" w:hAnsi="Arial" w:cs="Arial"/>
+                <w:sz w:val="20"/>
+                <w:szCs w:val="20"/>
+              </w:rPr>
+            </w:pPr>
+          </w:p>
+        </w:tc>
+        <w:tc>
+          <w:tcPr>
+            <w:tcW w:w="630" w:type="dxa"/>
+            <w:tcBorders>
+              <w:top w:val="single" w:sz="4" w:space="0" w:color="000000"/>
+              <w:left w:val="nil"/>
+              <w:bottom w:val="single" w:sz="4" w:space="0" w:color="000000"/>
+              <w:right w:val="single" w:sz="4" w:space="0" w:color="000000"/>
+            </w:tcBorders>
+            <w:shd w:val="clear" w:color="auto" w:fill="FFFFFF" w:themeFill="background1"/>
+            <w:vAlign w:val="bottom"/>
+          </w:tcPr>
+          <w:p>
+            <w:pPr>
+              <w:spacing w:after="0" w:line="240" w:lineRule="auto"/>
+              <w:rPr>
+                <w:rFonts w:ascii="Arial" w:hAnsi="Arial" w:cs="Arial"/>
+                <w:sz w:val="20"/>
+                <w:szCs w:val="20"/>
+              </w:rPr>
+            </w:pPr>
+          </w:p>
+        </w:tc>
+        <w:tc>
+          <w:tcPr>
+            <w:tcW w:w="630" w:type="dxa"/>
+            <w:tcBorders>
+              <w:top w:val="single" w:sz="4" w:space="0" w:color="000000"/>
+              <w:left w:val="nil"/>
+              <w:bottom w:val="single" w:sz="4" w:space="0" w:color="000000"/>
+              <w:right w:val="single" w:sz="4" w:space="0" w:color="000000"/>
+            </w:tcBorders>
+            <w:shd w:val="clear" w:color="auto" w:fill="FFFFFF" w:themeFill="background1"/>
+            <w:vAlign w:val="bottom"/>
+          </w:tcPr>
+          <w:p>
+            <w:pPr>
+              <w:spacing w:after="0" w:line="240" w:lineRule="auto"/>
+              <w:rPr>
+                <w:rFonts w:ascii="Arial" w:hAnsi="Arial" w:cs="Arial"/>
+                <w:sz w:val="20"/>
+                <w:szCs w:val="20"/>
+              </w:rPr>
+            </w:pPr>
+          </w:p>
+        </w:tc>
+        <w:tc>
+          <w:tcPr>
+            <w:tcW w:w="630" w:type="dxa"/>
+            <w:tcBorders>
+              <w:top w:val="single" w:sz="4" w:space="0" w:color="000000"/>
+              <w:left w:val="nil"/>
+              <w:bottom w:val="single" w:sz="4" w:space="0" w:color="000000"/>
+              <w:right w:val="single" w:sz="4" w:space="0" w:color="000000"/>
+            </w:tcBorders>
+            <w:shd w:val="clear" w:color="auto" w:fill="FFFFFF" w:themeFill="background1"/>
+            <w:vAlign w:val="bottom"/>
+          </w:tcPr>
+          <w:p>
+            <w:pPr>
+              <w:spacing w:after="0" w:line="240" w:lineRule="auto"/>
+              <w:rPr>
+                <w:rFonts w:ascii="Arial" w:hAnsi="Arial" w:cs="Arial"/>
+                <w:sz w:val="20"/>
+                <w:szCs w:val="20"/>
+              </w:rPr>
+            </w:pPr>
+          </w:p>
+        </w:tc>
+        <w:tc>
+          <w:tcPr>
+            <w:tcW w:w="630" w:type="dxa"/>
+            <w:tcBorders>
+              <w:top w:val="single" w:sz="4" w:space="0" w:color="000000"/>
+              <w:left w:val="nil"/>
+              <w:bottom w:val="single" w:sz="4" w:space="0" w:color="000000"/>
+              <w:right w:val="single" w:sz="4" w:space="0" w:color="000000"/>
+            </w:tcBorders>
+            <w:shd w:val="clear" w:color="auto" w:fill="FFFFFF" w:themeFill="background1"/>
+            <w:vAlign w:val="bottom"/>
+          </w:tcPr>
+          <w:p>
+            <w:pPr>
+              <w:spacing w:after="0" w:line="240" w:lineRule="auto"/>
+              <w:rPr>
+                <w:rFonts w:ascii="Arial" w:hAnsi="Arial" w:cs="Arial"/>
+                <w:sz w:val="20"/>
+                <w:szCs w:val="20"/>
+              </w:rPr>
+            </w:pPr>
+          </w:p>
+        </w:tc>
+        <w:tc>
+          <w:tcPr>
+            <w:tcW w:w="630" w:type="dxa"/>
+            <w:tcBorders>
+              <w:top w:val="single" w:sz="4" w:space="0" w:color="000000"/>
+              <w:left w:val="nil"/>
+              <w:bottom w:val="single" w:sz="4" w:space="0" w:color="000000"/>
+              <w:right w:val="single" w:sz="4" w:space="0" w:color="000000"/>
+            </w:tcBorders>
+            <w:shd w:val="clear" w:color="auto" w:fill="FFFFFF" w:themeFill="background1"/>
+            <w:vAlign w:val="bottom"/>
+          </w:tcPr>
+          <w:p>
+            <w:pPr>
+              <w:spacing w:after="0" w:line="240" w:lineRule="auto"/>
+              <w:rPr>
+                <w:rFonts w:ascii="Arial" w:hAnsi="Arial" w:cs="Arial"/>
+                <w:color w:val="0070C0"/>
+                <w:sz w:val="20"/>
+                <w:szCs w:val="20"/>
+              </w:rPr>
+            </w:pPr>
+          </w:p>
+        </w:tc>
+        <w:tc>
+          <w:tcPr>
+            <w:tcW w:w="630" w:type="dxa"/>
+            <w:tcBorders>
+              <w:top w:val="single" w:sz="4" w:space="0" w:color="000000"/>
+              <w:left w:val="nil"/>
+              <w:bottom w:val="single" w:sz="4" w:space="0" w:color="000000"/>
+              <w:right w:val="single" w:sz="4" w:space="0" w:color="000000"/>
+            </w:tcBorders>
+            <w:shd w:val="clear" w:color="auto" w:fill="FFFFFF" w:themeFill="background1"/>
+            <w:vAlign w:val="bottom"/>
+          </w:tcPr>
+          <w:p>
+            <w:pPr>
+              <w:spacing w:after="0" w:line="240" w:lineRule="auto"/>
+              <w:rPr>
+                <w:rFonts w:ascii="Arial" w:hAnsi="Arial" w:cs="Arial"/>
+                <w:color w:val="0070C0"/>
+                <w:sz w:val="20"/>
+                <w:szCs w:val="20"/>
+              </w:rPr>
+            </w:pPr>
+          </w:p>
+        </w:tc>
+        <w:tc>
+          <w:tcPr>
+            <w:tcW w:w="630" w:type="dxa"/>
+            <w:tcBorders>
+              <w:top w:val="single" w:sz="4" w:space="0" w:color="000000"/>
+              <w:left w:val="nil"/>
+              <w:bottom w:val="single" w:sz="4" w:space="0" w:color="000000"/>
+              <w:right w:val="single" w:sz="4" w:space="0" w:color="000000"/>
+            </w:tcBorders>
+            <w:shd w:val="clear" w:color="auto" w:fill="FFFFFF" w:themeFill="background1"/>
+            <w:vAlign w:val="bottom"/>
+          </w:tcPr>
+          <w:p>
+            <w:pPr>
+              <w:spacing w:after="0" w:line="240" w:lineRule="auto"/>
+              <w:rPr>
+                <w:rFonts w:ascii="Arial" w:hAnsi="Arial" w:cs="Arial"/>
+                <w:sz w:val="20"/>
+                <w:szCs w:val="20"/>
+              </w:rPr>
+            </w:pPr>
+          </w:p>
+        </w:tc>
+        <w:tc>
+          <w:tcPr>
+            <w:tcW w:w="630" w:type="dxa"/>
+            <w:tcBorders>
+              <w:top w:val="single" w:sz="4" w:space="0" w:color="000000"/>
+              <w:left w:val="nil"/>
+              <w:bottom w:val="single" w:sz="4" w:space="0" w:color="000000"/>
+              <w:right w:val="single" w:sz="4" w:space="0" w:color="000000"/>
+            </w:tcBorders>
+            <w:shd w:val="clear" w:color="auto" w:fill="FFFFFF" w:themeFill="background1"/>
+            <w:vAlign w:val="bottom"/>
+          </w:tcPr>
+          <w:p>
+            <w:pPr>
+              <w:spacing w:after="0" w:line="240" w:lineRule="auto"/>
+              <w:rPr>
+                <w:rFonts w:ascii="Arial" w:eastAsia="Arial" w:hAnsi="Arial" w:cs="Arial"/>
+                <w:sz w:val="20"/>
+                <w:szCs w:val="20"/>
+              </w:rPr>
+            </w:pPr>
+          </w:p>
+        </w:tc>
+        <w:tc>
+          <w:tcPr>
+            <w:tcW w:w="630" w:type="dxa"/>
+            <w:tcBorders>
+              <w:top w:val="single" w:sz="4" w:space="0" w:color="000000"/>
+              <w:left w:val="nil"/>
+              <w:bottom w:val="single" w:sz="4" w:space="0" w:color="000000"/>
+              <w:right w:val="single" w:sz="4" w:space="0" w:color="000000"/>
+            </w:tcBorders>
+            <w:shd w:val="clear" w:color="auto" w:fill="FFFFFF" w:themeFill="background1"/>
+            <w:vAlign w:val="bottom"/>
+          </w:tcPr>
+          <w:p>
+            <w:pPr>
+              <w:spacing w:after="0" w:line="240" w:lineRule="auto"/>
+              <w:rPr>
+                <w:rFonts w:ascii="Arial" w:eastAsia="Arial" w:hAnsi="Arial" w:cs="Arial"/>
+                <w:sz w:val="20"/>
+                <w:szCs w:val="20"/>
+              </w:rPr>
+            </w:pPr>
+          </w:p>
+        </w:tc>
+      </w:tr>
     </w:tbl>
+    <w:p/>
+    <w:p/>
+    <w:p/>
+    <w:p/>
+    <w:p/>
+    <w:p/>
+    <w:p/>
+    <w:p/>
     <w:p/>
     <w:p/>
     <w:p/>
@@ -11461,7 +11635,7 @@
           </w:tcPr>
           <w:p>
             <w:pPr>
-              <w:pStyle w:val="Heading1"/>
+              <w:pStyle w:val="Ttulo1"/>
               <w:jc w:val="center"/>
               <w:rPr>
                 <w:rFonts w:ascii="Arial" w:hAnsi="Arial" w:cs="Arial"/>
@@ -11477,6 +11651,7 @@
                 <w:sz w:val="22"/>
                 <w:szCs w:val="22"/>
               </w:rPr>
+              <w:lastRenderedPageBreak/>
               <w:br w:type="page"/>
             </w:r>
             <w:r>
@@ -12734,6 +12909,14 @@
                 <w:szCs w:val="20"/>
               </w:rPr>
             </w:pPr>
+            <w:r>
+              <w:rPr>
+                <w:rFonts w:ascii="Arial" w:eastAsia="Arial" w:hAnsi="Arial" w:cs="Arial"/>
+                <w:sz w:val="20"/>
+                <w:szCs w:val="20"/>
+              </w:rPr>
+              <w:t>Incremento 5</w:t>
+            </w:r>
           </w:p>
         </w:tc>
         <w:tc>
@@ -12756,36 +12939,90 @@
                 <w:szCs w:val="20"/>
               </w:rPr>
             </w:pPr>
-          </w:p>
-        </w:tc>
-        <w:tc>
-          <w:tcPr>
-            <w:tcW w:w="630" w:type="dxa"/>
-            <w:tcBorders>
-              <w:top w:val="single" w:sz="4" w:space="0" w:color="000000"/>
-              <w:left w:val="nil"/>
-              <w:bottom w:val="single" w:sz="4" w:space="0" w:color="000000"/>
-              <w:right w:val="single" w:sz="4" w:space="0" w:color="000000"/>
-            </w:tcBorders>
-            <w:shd w:val="clear" w:color="auto" w:fill="FFFFFF" w:themeFill="background1"/>
-            <w:vAlign w:val="bottom"/>
-          </w:tcPr>
-          <w:p>
-            <w:pPr>
-              <w:spacing w:after="0" w:line="240" w:lineRule="auto"/>
-              <w:rPr>
-                <w:rFonts w:ascii="Arial" w:hAnsi="Arial" w:cs="Arial"/>
-                <w:sz w:val="20"/>
-                <w:szCs w:val="20"/>
-              </w:rPr>
-            </w:pPr>
-            <w:r>
-              <w:rPr>
-                <w:rFonts w:ascii="Arial" w:hAnsi="Arial" w:cs="Arial"/>
-                <w:sz w:val="20"/>
-                <w:szCs w:val="20"/>
-              </w:rPr>
-              <w:t> </w:t>
+            <w:r>
+              <w:rPr>
+                <w:rFonts w:ascii="Arial" w:eastAsia="Arial" w:hAnsi="Arial" w:cs="Arial"/>
+                <w:sz w:val="20"/>
+                <w:szCs w:val="20"/>
+              </w:rPr>
+              <w:t>Visão comportamental</w:t>
+            </w:r>
+          </w:p>
+          <w:p>
+            <w:pPr>
+              <w:spacing w:after="0" w:line="240" w:lineRule="auto"/>
+              <w:rPr>
+                <w:rFonts w:ascii="Arial" w:eastAsia="Arial" w:hAnsi="Arial" w:cs="Arial"/>
+                <w:sz w:val="20"/>
+                <w:szCs w:val="20"/>
+              </w:rPr>
+            </w:pPr>
+            <w:r>
+              <w:rPr>
+                <w:rFonts w:ascii="Arial" w:eastAsia="Arial" w:hAnsi="Arial" w:cs="Arial"/>
+                <w:sz w:val="20"/>
+                <w:szCs w:val="20"/>
+              </w:rPr>
+              <w:t>Visão da arquitetura.</w:t>
+            </w:r>
+          </w:p>
+          <w:p>
+            <w:pPr>
+              <w:spacing w:after="0" w:line="240" w:lineRule="auto"/>
+              <w:rPr>
+                <w:rFonts w:ascii="Arial" w:eastAsia="Arial" w:hAnsi="Arial" w:cs="Arial"/>
+                <w:sz w:val="20"/>
+                <w:szCs w:val="20"/>
+              </w:rPr>
+            </w:pPr>
+            <w:r>
+              <w:rPr>
+                <w:rFonts w:ascii="Arial" w:eastAsia="Arial" w:hAnsi="Arial" w:cs="Arial"/>
+                <w:sz w:val="20"/>
+                <w:szCs w:val="20"/>
+              </w:rPr>
+              <w:t xml:space="preserve">Visão estrutural  </w:t>
+            </w:r>
+          </w:p>
+        </w:tc>
+        <w:tc>
+          <w:tcPr>
+            <w:tcW w:w="630" w:type="dxa"/>
+            <w:tcBorders>
+              <w:top w:val="single" w:sz="4" w:space="0" w:color="000000"/>
+              <w:left w:val="nil"/>
+              <w:bottom w:val="single" w:sz="4" w:space="0" w:color="000000"/>
+              <w:right w:val="single" w:sz="4" w:space="0" w:color="000000"/>
+            </w:tcBorders>
+            <w:shd w:val="clear" w:color="auto" w:fill="FFFFFF" w:themeFill="background1"/>
+            <w:vAlign w:val="bottom"/>
+          </w:tcPr>
+          <w:p>
+            <w:pPr>
+              <w:spacing w:after="0" w:line="240" w:lineRule="auto"/>
+              <w:rPr>
+                <w:rFonts w:ascii="Arial" w:hAnsi="Arial" w:cs="Arial"/>
+                <w:sz w:val="20"/>
+                <w:szCs w:val="20"/>
+              </w:rPr>
+            </w:pPr>
+            <w:r>
+              <w:rPr>
+                <w:rFonts w:ascii="Arial" w:hAnsi="Arial" w:cs="Arial"/>
+                <w:color w:val="4472C4" w:themeColor="accent5"/>
+                <w:sz w:val="20"/>
+                <w:szCs w:val="20"/>
+              </w:rPr>
+              <w:t> </w:t>
+            </w:r>
+            <w:r>
+              <w:rPr>
+                <w:rFonts w:ascii="Arial" w:hAnsi="Arial" w:cs="Arial"/>
+                <w:color w:val="4472C4" w:themeColor="accent5"/>
+                <w:sz w:val="20"/>
+                <w:szCs w:val="20"/>
+              </w:rPr>
+              <w:t>P</w:t>
             </w:r>
           </w:p>
         </w:tc>
@@ -13503,130 +13740,132 @@
               </w:rPr>
               <w:t> </w:t>
             </w:r>
-          </w:p>
-        </w:tc>
-        <w:tc>
-          <w:tcPr>
-            <w:tcW w:w="630" w:type="dxa"/>
-            <w:tcBorders>
-              <w:top w:val="single" w:sz="4" w:space="0" w:color="000000"/>
-              <w:left w:val="nil"/>
-              <w:bottom w:val="single" w:sz="4" w:space="0" w:color="000000"/>
-              <w:right w:val="single" w:sz="4" w:space="0" w:color="000000"/>
-            </w:tcBorders>
-            <w:shd w:val="clear" w:color="auto" w:fill="FFFFFF" w:themeFill="background1"/>
-            <w:vAlign w:val="bottom"/>
-          </w:tcPr>
-          <w:p>
-            <w:pPr>
-              <w:spacing w:after="0" w:line="240" w:lineRule="auto"/>
-              <w:rPr>
-                <w:rFonts w:ascii="Arial" w:eastAsia="Arial" w:hAnsi="Arial" w:cs="Arial"/>
-                <w:sz w:val="20"/>
-                <w:szCs w:val="20"/>
-              </w:rPr>
-            </w:pPr>
-            <w:r>
-              <w:rPr>
-                <w:rFonts w:ascii="Arial" w:eastAsia="Arial" w:hAnsi="Arial" w:cs="Arial"/>
-                <w:sz w:val="20"/>
-                <w:szCs w:val="20"/>
-              </w:rPr>
-              <w:t> </w:t>
-            </w:r>
-          </w:p>
-        </w:tc>
-        <w:tc>
-          <w:tcPr>
-            <w:tcW w:w="630" w:type="dxa"/>
-            <w:tcBorders>
-              <w:top w:val="single" w:sz="4" w:space="0" w:color="000000"/>
-              <w:left w:val="nil"/>
-              <w:bottom w:val="single" w:sz="4" w:space="0" w:color="000000"/>
-              <w:right w:val="single" w:sz="4" w:space="0" w:color="000000"/>
-            </w:tcBorders>
-            <w:shd w:val="clear" w:color="auto" w:fill="FFFFFF" w:themeFill="background1"/>
-            <w:vAlign w:val="bottom"/>
-          </w:tcPr>
-          <w:p>
-            <w:pPr>
-              <w:spacing w:after="0" w:line="240" w:lineRule="auto"/>
-              <w:rPr>
-                <w:rFonts w:ascii="Arial" w:hAnsi="Arial" w:cs="Arial"/>
-                <w:sz w:val="20"/>
-                <w:szCs w:val="20"/>
-              </w:rPr>
-            </w:pPr>
-            <w:r>
-              <w:rPr>
-                <w:rFonts w:ascii="Arial" w:hAnsi="Arial" w:cs="Arial"/>
-                <w:sz w:val="20"/>
-                <w:szCs w:val="20"/>
-              </w:rPr>
-              <w:t> </w:t>
-            </w:r>
-          </w:p>
-        </w:tc>
-        <w:tc>
-          <w:tcPr>
-            <w:tcW w:w="630" w:type="dxa"/>
-            <w:tcBorders>
-              <w:top w:val="single" w:sz="4" w:space="0" w:color="000000"/>
-              <w:left w:val="nil"/>
-              <w:bottom w:val="single" w:sz="4" w:space="0" w:color="000000"/>
-              <w:right w:val="single" w:sz="4" w:space="0" w:color="000000"/>
-            </w:tcBorders>
-            <w:shd w:val="clear" w:color="auto" w:fill="FFFFFF" w:themeFill="background1"/>
-            <w:vAlign w:val="bottom"/>
-          </w:tcPr>
-          <w:p>
-            <w:pPr>
-              <w:spacing w:after="0" w:line="240" w:lineRule="auto"/>
-              <w:rPr>
-                <w:rFonts w:ascii="Arial" w:hAnsi="Arial" w:cs="Arial"/>
-                <w:sz w:val="20"/>
-                <w:szCs w:val="20"/>
-              </w:rPr>
-            </w:pPr>
-            <w:r>
-              <w:rPr>
-                <w:rFonts w:ascii="Arial" w:hAnsi="Arial" w:cs="Arial"/>
-                <w:sz w:val="20"/>
-                <w:szCs w:val="20"/>
-              </w:rPr>
-              <w:t> </w:t>
-            </w:r>
-          </w:p>
-        </w:tc>
-        <w:tc>
-          <w:tcPr>
-            <w:tcW w:w="630" w:type="dxa"/>
-            <w:tcBorders>
-              <w:top w:val="single" w:sz="4" w:space="0" w:color="000000"/>
-              <w:left w:val="nil"/>
-              <w:bottom w:val="single" w:sz="4" w:space="0" w:color="000000"/>
-              <w:right w:val="single" w:sz="4" w:space="0" w:color="000000"/>
-            </w:tcBorders>
-            <w:shd w:val="clear" w:color="auto" w:fill="FFFFFF" w:themeFill="background1"/>
-            <w:vAlign w:val="bottom"/>
-          </w:tcPr>
-          <w:p>
-            <w:pPr>
-              <w:spacing w:after="0" w:line="240" w:lineRule="auto"/>
-              <w:rPr>
-                <w:rFonts w:ascii="Arial" w:hAnsi="Arial" w:cs="Arial"/>
-                <w:sz w:val="20"/>
-                <w:szCs w:val="20"/>
-              </w:rPr>
-            </w:pPr>
-            <w:r>
-              <w:rPr>
-                <w:rFonts w:ascii="Arial" w:hAnsi="Arial" w:cs="Arial"/>
-                <w:sz w:val="20"/>
-                <w:szCs w:val="20"/>
-              </w:rPr>
-              <w:t> </w:t>
-            </w:r>
+            <w:r>
+              <w:rPr>
+                <w:rFonts w:ascii="Arial" w:eastAsia="Arial" w:hAnsi="Arial" w:cs="Arial"/>
+                <w:color w:val="70AD47" w:themeColor="accent6"/>
+                <w:sz w:val="20"/>
+                <w:szCs w:val="20"/>
+              </w:rPr>
+              <w:t>R</w:t>
+            </w:r>
+          </w:p>
+        </w:tc>
+        <w:tc>
+          <w:tcPr>
+            <w:tcW w:w="630" w:type="dxa"/>
+            <w:tcBorders>
+              <w:top w:val="single" w:sz="4" w:space="0" w:color="000000"/>
+              <w:left w:val="nil"/>
+              <w:bottom w:val="single" w:sz="4" w:space="0" w:color="000000"/>
+              <w:right w:val="single" w:sz="4" w:space="0" w:color="000000"/>
+            </w:tcBorders>
+            <w:shd w:val="clear" w:color="auto" w:fill="FFFFFF" w:themeFill="background1"/>
+            <w:vAlign w:val="bottom"/>
+          </w:tcPr>
+          <w:p>
+            <w:pPr>
+              <w:spacing w:after="0" w:line="240" w:lineRule="auto"/>
+              <w:rPr>
+                <w:rFonts w:ascii="Arial" w:eastAsia="Arial" w:hAnsi="Arial" w:cs="Arial"/>
+                <w:sz w:val="20"/>
+                <w:szCs w:val="20"/>
+              </w:rPr>
+            </w:pPr>
+            <w:r>
+              <w:rPr>
+                <w:rFonts w:ascii="Arial" w:eastAsia="Arial" w:hAnsi="Arial" w:cs="Arial"/>
+                <w:color w:val="0070C0"/>
+                <w:sz w:val="20"/>
+                <w:szCs w:val="20"/>
+              </w:rPr>
+              <w:t> </w:t>
+            </w:r>
+          </w:p>
+        </w:tc>
+        <w:tc>
+          <w:tcPr>
+            <w:tcW w:w="630" w:type="dxa"/>
+            <w:tcBorders>
+              <w:top w:val="single" w:sz="4" w:space="0" w:color="000000"/>
+              <w:left w:val="nil"/>
+              <w:bottom w:val="single" w:sz="4" w:space="0" w:color="000000"/>
+              <w:right w:val="single" w:sz="4" w:space="0" w:color="000000"/>
+            </w:tcBorders>
+            <w:shd w:val="clear" w:color="auto" w:fill="FFFFFF" w:themeFill="background1"/>
+            <w:vAlign w:val="bottom"/>
+          </w:tcPr>
+          <w:p>
+            <w:pPr>
+              <w:spacing w:after="0" w:line="240" w:lineRule="auto"/>
+              <w:rPr>
+                <w:rFonts w:ascii="Arial" w:hAnsi="Arial" w:cs="Arial"/>
+                <w:sz w:val="20"/>
+                <w:szCs w:val="20"/>
+              </w:rPr>
+            </w:pPr>
+            <w:r>
+              <w:rPr>
+                <w:rFonts w:ascii="Arial" w:hAnsi="Arial" w:cs="Arial"/>
+                <w:sz w:val="20"/>
+                <w:szCs w:val="20"/>
+              </w:rPr>
+              <w:t> </w:t>
+            </w:r>
+          </w:p>
+        </w:tc>
+        <w:tc>
+          <w:tcPr>
+            <w:tcW w:w="630" w:type="dxa"/>
+            <w:tcBorders>
+              <w:top w:val="single" w:sz="4" w:space="0" w:color="000000"/>
+              <w:left w:val="nil"/>
+              <w:bottom w:val="single" w:sz="4" w:space="0" w:color="000000"/>
+              <w:right w:val="single" w:sz="4" w:space="0" w:color="000000"/>
+            </w:tcBorders>
+            <w:shd w:val="clear" w:color="auto" w:fill="FFFFFF" w:themeFill="background1"/>
+            <w:vAlign w:val="bottom"/>
+          </w:tcPr>
+          <w:p>
+            <w:pPr>
+              <w:spacing w:after="0" w:line="240" w:lineRule="auto"/>
+              <w:rPr>
+                <w:rFonts w:ascii="Arial" w:hAnsi="Arial" w:cs="Arial"/>
+                <w:sz w:val="20"/>
+                <w:szCs w:val="20"/>
+              </w:rPr>
+            </w:pPr>
+            <w:r>
+              <w:rPr>
+                <w:rFonts w:ascii="Arial" w:hAnsi="Arial" w:cs="Arial"/>
+                <w:sz w:val="20"/>
+                <w:szCs w:val="20"/>
+              </w:rPr>
+              <w:t> </w:t>
+            </w:r>
+          </w:p>
+        </w:tc>
+        <w:tc>
+          <w:tcPr>
+            <w:tcW w:w="630" w:type="dxa"/>
+            <w:tcBorders>
+              <w:top w:val="single" w:sz="4" w:space="0" w:color="000000"/>
+              <w:left w:val="nil"/>
+              <w:bottom w:val="single" w:sz="4" w:space="0" w:color="000000"/>
+              <w:right w:val="single" w:sz="4" w:space="0" w:color="000000"/>
+            </w:tcBorders>
+            <w:shd w:val="clear" w:color="auto" w:fill="FFFFFF" w:themeFill="background1"/>
+            <w:vAlign w:val="bottom"/>
+          </w:tcPr>
+          <w:p>
+            <w:pPr>
+              <w:spacing w:after="0" w:line="240" w:lineRule="auto"/>
+              <w:rPr>
+                <w:rFonts w:ascii="Arial" w:hAnsi="Arial" w:cs="Arial"/>
+                <w:sz w:val="20"/>
+                <w:szCs w:val="20"/>
+              </w:rPr>
+            </w:pPr>
           </w:p>
         </w:tc>
         <w:tc>
@@ -13840,6 +14079,24 @@
                 <w:szCs w:val="20"/>
               </w:rPr>
             </w:pPr>
+            <w:r>
+              <w:rPr>
+                <w:rFonts w:ascii="Arial" w:eastAsia="Arial" w:hAnsi="Arial" w:cs="Arial"/>
+                <w:sz w:val="20"/>
+                <w:szCs w:val="20"/>
+              </w:rPr>
+              <w:t>Incremento 6</w:t>
+            </w:r>
+          </w:p>
+          <w:p>
+            <w:pPr>
+              <w:spacing w:after="0" w:line="240" w:lineRule="auto"/>
+              <w:rPr>
+                <w:rFonts w:ascii="Arial" w:eastAsia="Arial" w:hAnsi="Arial" w:cs="Arial"/>
+                <w:sz w:val="20"/>
+                <w:szCs w:val="20"/>
+              </w:rPr>
+            </w:pPr>
           </w:p>
         </w:tc>
         <w:tc>
@@ -13862,6 +14119,79 @@
                 <w:szCs w:val="20"/>
               </w:rPr>
             </w:pPr>
+            <w:r>
+              <w:rPr>
+                <w:rFonts w:ascii="Arial" w:eastAsia="Arial" w:hAnsi="Arial" w:cs="Arial"/>
+                <w:sz w:val="20"/>
+                <w:szCs w:val="20"/>
+              </w:rPr>
+              <w:t xml:space="preserve">Apresentação do projeto para a comissão interna da </w:t>
+            </w:r>
+            <w:proofErr w:type="spellStart"/>
+            <w:r>
+              <w:rPr>
+                <w:rFonts w:ascii="Arial" w:eastAsia="Arial" w:hAnsi="Arial" w:cs="Arial"/>
+                <w:sz w:val="20"/>
+                <w:szCs w:val="20"/>
+              </w:rPr>
+              <w:t>Faitec</w:t>
+            </w:r>
+            <w:proofErr w:type="spellEnd"/>
+            <w:r>
+              <w:rPr>
+                <w:rFonts w:ascii="Arial" w:eastAsia="Arial" w:hAnsi="Arial" w:cs="Arial"/>
+                <w:sz w:val="20"/>
+                <w:szCs w:val="20"/>
+              </w:rPr>
+              <w:t>;</w:t>
+            </w:r>
+            <w:r>
+              <w:rPr>
+                <w:rFonts w:ascii="Arial" w:eastAsia="Arial" w:hAnsi="Arial" w:cs="Arial"/>
+                <w:sz w:val="20"/>
+                <w:szCs w:val="20"/>
+              </w:rPr>
+              <w:br/>
+              <w:t xml:space="preserve">Projeto </w:t>
+            </w:r>
+            <w:proofErr w:type="spellStart"/>
+            <w:r>
+              <w:rPr>
+                <w:rFonts w:ascii="Arial" w:eastAsia="Arial" w:hAnsi="Arial" w:cs="Arial"/>
+                <w:sz w:val="20"/>
+                <w:szCs w:val="20"/>
+              </w:rPr>
+              <w:t>Semi-Pronto</w:t>
+            </w:r>
+            <w:proofErr w:type="spellEnd"/>
+          </w:p>
+          <w:p>
+            <w:pPr>
+              <w:spacing w:after="0" w:line="240" w:lineRule="auto"/>
+              <w:rPr>
+                <w:rFonts w:ascii="Arial" w:eastAsia="Arial" w:hAnsi="Arial" w:cs="Arial"/>
+                <w:sz w:val="20"/>
+                <w:szCs w:val="20"/>
+              </w:rPr>
+            </w:pPr>
+            <w:r>
+              <w:rPr>
+                <w:rFonts w:ascii="Arial" w:eastAsia="Arial" w:hAnsi="Arial" w:cs="Arial"/>
+                <w:sz w:val="20"/>
+                <w:szCs w:val="20"/>
+              </w:rPr>
+              <w:t>Melhorias solicitadas da entrega anterior.</w:t>
+            </w:r>
+          </w:p>
+          <w:p>
+            <w:pPr>
+              <w:spacing w:after="0" w:line="240" w:lineRule="auto"/>
+              <w:rPr>
+                <w:rFonts w:ascii="Arial" w:eastAsia="Arial" w:hAnsi="Arial" w:cs="Arial"/>
+                <w:sz w:val="20"/>
+                <w:szCs w:val="20"/>
+              </w:rPr>
+            </w:pPr>
           </w:p>
         </w:tc>
         <w:tc>
@@ -14074,99 +14404,110 @@
             <w:r>
               <w:rPr>
                 <w:rFonts w:ascii="Arial" w:eastAsia="Arial" w:hAnsi="Arial" w:cs="Arial"/>
-                <w:sz w:val="20"/>
-                <w:szCs w:val="20"/>
-              </w:rPr>
-              <w:t> </w:t>
-            </w:r>
-          </w:p>
-        </w:tc>
-        <w:tc>
-          <w:tcPr>
-            <w:tcW w:w="630" w:type="dxa"/>
-            <w:tcBorders>
-              <w:top w:val="single" w:sz="4" w:space="0" w:color="000000"/>
-              <w:left w:val="nil"/>
-              <w:bottom w:val="single" w:sz="4" w:space="0" w:color="000000"/>
-              <w:right w:val="single" w:sz="4" w:space="0" w:color="000000"/>
-            </w:tcBorders>
-            <w:shd w:val="clear" w:color="auto" w:fill="FFFFFF" w:themeFill="background1"/>
-            <w:vAlign w:val="bottom"/>
-          </w:tcPr>
-          <w:p>
-            <w:pPr>
-              <w:spacing w:after="0" w:line="240" w:lineRule="auto"/>
-              <w:rPr>
-                <w:rFonts w:ascii="Arial" w:hAnsi="Arial" w:cs="Arial"/>
-                <w:sz w:val="20"/>
-                <w:szCs w:val="20"/>
-              </w:rPr>
-            </w:pPr>
-            <w:r>
-              <w:rPr>
-                <w:rFonts w:ascii="Arial" w:hAnsi="Arial" w:cs="Arial"/>
-                <w:sz w:val="20"/>
-                <w:szCs w:val="20"/>
-              </w:rPr>
-              <w:t> </w:t>
-            </w:r>
-          </w:p>
-        </w:tc>
-        <w:tc>
-          <w:tcPr>
-            <w:tcW w:w="630" w:type="dxa"/>
-            <w:tcBorders>
-              <w:top w:val="single" w:sz="4" w:space="0" w:color="000000"/>
-              <w:left w:val="nil"/>
-              <w:bottom w:val="single" w:sz="4" w:space="0" w:color="000000"/>
-              <w:right w:val="single" w:sz="4" w:space="0" w:color="000000"/>
-            </w:tcBorders>
-            <w:shd w:val="clear" w:color="auto" w:fill="FFFFFF" w:themeFill="background1"/>
-            <w:vAlign w:val="bottom"/>
-          </w:tcPr>
-          <w:p>
-            <w:pPr>
-              <w:spacing w:after="0" w:line="240" w:lineRule="auto"/>
-              <w:rPr>
-                <w:rFonts w:ascii="Arial" w:hAnsi="Arial" w:cs="Arial"/>
-                <w:sz w:val="20"/>
-                <w:szCs w:val="20"/>
-              </w:rPr>
-            </w:pPr>
-            <w:r>
-              <w:rPr>
-                <w:rFonts w:ascii="Arial" w:hAnsi="Arial" w:cs="Arial"/>
-                <w:sz w:val="20"/>
-                <w:szCs w:val="20"/>
-              </w:rPr>
-              <w:t> </w:t>
-            </w:r>
-          </w:p>
-        </w:tc>
-        <w:tc>
-          <w:tcPr>
-            <w:tcW w:w="630" w:type="dxa"/>
-            <w:tcBorders>
-              <w:top w:val="single" w:sz="4" w:space="0" w:color="000000"/>
-              <w:left w:val="nil"/>
-              <w:bottom w:val="single" w:sz="4" w:space="0" w:color="000000"/>
-              <w:right w:val="single" w:sz="4" w:space="0" w:color="000000"/>
-            </w:tcBorders>
-            <w:shd w:val="clear" w:color="auto" w:fill="FFFFFF" w:themeFill="background1"/>
-            <w:vAlign w:val="bottom"/>
-          </w:tcPr>
-          <w:p>
-            <w:pPr>
-              <w:spacing w:after="0" w:line="240" w:lineRule="auto"/>
-              <w:rPr>
-                <w:rFonts w:ascii="Arial" w:hAnsi="Arial" w:cs="Arial"/>
-                <w:sz w:val="20"/>
-                <w:szCs w:val="20"/>
-              </w:rPr>
-            </w:pPr>
-            <w:r>
-              <w:rPr>
-                <w:rFonts w:ascii="Arial" w:hAnsi="Arial" w:cs="Arial"/>
+                <w:color w:val="4472C4" w:themeColor="accent5"/>
+                <w:sz w:val="20"/>
+                <w:szCs w:val="20"/>
+              </w:rPr>
+              <w:t> </w:t>
+            </w:r>
+            <w:r>
+              <w:rPr>
+                <w:rFonts w:ascii="Arial" w:eastAsia="Arial" w:hAnsi="Arial" w:cs="Arial"/>
+                <w:color w:val="4472C4" w:themeColor="accent5"/>
+                <w:sz w:val="20"/>
+                <w:szCs w:val="20"/>
+              </w:rPr>
+              <w:t>P</w:t>
+            </w:r>
+          </w:p>
+        </w:tc>
+        <w:tc>
+          <w:tcPr>
+            <w:tcW w:w="630" w:type="dxa"/>
+            <w:tcBorders>
+              <w:top w:val="single" w:sz="4" w:space="0" w:color="000000"/>
+              <w:left w:val="nil"/>
+              <w:bottom w:val="single" w:sz="4" w:space="0" w:color="000000"/>
+              <w:right w:val="single" w:sz="4" w:space="0" w:color="000000"/>
+            </w:tcBorders>
+            <w:shd w:val="clear" w:color="auto" w:fill="FFFFFF" w:themeFill="background1"/>
+            <w:vAlign w:val="bottom"/>
+          </w:tcPr>
+          <w:p>
+            <w:pPr>
+              <w:spacing w:after="0" w:line="240" w:lineRule="auto"/>
+              <w:rPr>
+                <w:rFonts w:ascii="Arial" w:hAnsi="Arial" w:cs="Arial"/>
+                <w:sz w:val="20"/>
+                <w:szCs w:val="20"/>
+              </w:rPr>
+            </w:pPr>
+            <w:r>
+              <w:rPr>
+                <w:rFonts w:ascii="Arial" w:hAnsi="Arial" w:cs="Arial"/>
+                <w:sz w:val="20"/>
+                <w:szCs w:val="20"/>
+              </w:rPr>
+              <w:t> </w:t>
+            </w:r>
+          </w:p>
+        </w:tc>
+        <w:tc>
+          <w:tcPr>
+            <w:tcW w:w="630" w:type="dxa"/>
+            <w:tcBorders>
+              <w:top w:val="single" w:sz="4" w:space="0" w:color="000000"/>
+              <w:left w:val="nil"/>
+              <w:bottom w:val="single" w:sz="4" w:space="0" w:color="000000"/>
+              <w:right w:val="single" w:sz="4" w:space="0" w:color="000000"/>
+            </w:tcBorders>
+            <w:shd w:val="clear" w:color="auto" w:fill="FFFFFF" w:themeFill="background1"/>
+            <w:vAlign w:val="bottom"/>
+          </w:tcPr>
+          <w:p>
+            <w:pPr>
+              <w:spacing w:after="0" w:line="240" w:lineRule="auto"/>
+              <w:rPr>
+                <w:rFonts w:ascii="Arial" w:hAnsi="Arial" w:cs="Arial"/>
+                <w:sz w:val="20"/>
+                <w:szCs w:val="20"/>
+              </w:rPr>
+            </w:pPr>
+            <w:r>
+              <w:rPr>
+                <w:rFonts w:ascii="Arial" w:hAnsi="Arial" w:cs="Arial"/>
+                <w:sz w:val="20"/>
+                <w:szCs w:val="20"/>
+              </w:rPr>
+              <w:t> </w:t>
+            </w:r>
+          </w:p>
+        </w:tc>
+        <w:tc>
+          <w:tcPr>
+            <w:tcW w:w="630" w:type="dxa"/>
+            <w:tcBorders>
+              <w:top w:val="single" w:sz="4" w:space="0" w:color="000000"/>
+              <w:left w:val="nil"/>
+              <w:bottom w:val="single" w:sz="4" w:space="0" w:color="000000"/>
+              <w:right w:val="single" w:sz="4" w:space="0" w:color="000000"/>
+            </w:tcBorders>
+            <w:shd w:val="clear" w:color="auto" w:fill="FFFFFF" w:themeFill="background1"/>
+            <w:vAlign w:val="bottom"/>
+          </w:tcPr>
+          <w:p>
+            <w:pPr>
+              <w:spacing w:after="0" w:line="240" w:lineRule="auto"/>
+              <w:rPr>
+                <w:rFonts w:ascii="Arial" w:hAnsi="Arial" w:cs="Arial"/>
+                <w:sz w:val="20"/>
+                <w:szCs w:val="20"/>
+              </w:rPr>
+            </w:pPr>
+            <w:r>
+              <w:rPr>
+                <w:rFonts w:ascii="Arial" w:hAnsi="Arial" w:cs="Arial"/>
+                <w:color w:val="70AD47" w:themeColor="accent6"/>
                 <w:sz w:val="20"/>
                 <w:szCs w:val="20"/>
               </w:rPr>
@@ -14733,6 +15074,15 @@
               </w:rPr>
               <w:t> </w:t>
             </w:r>
+            <w:r>
+              <w:rPr>
+                <w:rFonts w:ascii="Arial" w:hAnsi="Arial" w:cs="Arial"/>
+                <w:color w:val="70AD47" w:themeColor="accent6"/>
+                <w:sz w:val="20"/>
+                <w:szCs w:val="20"/>
+              </w:rPr>
+              <w:t>R</w:t>
+            </w:r>
           </w:p>
         </w:tc>
         <w:tc>
@@ -14946,6 +15296,14 @@
                 <w:szCs w:val="20"/>
               </w:rPr>
             </w:pPr>
+            <w:r>
+              <w:rPr>
+                <w:rFonts w:ascii="Arial" w:eastAsia="Arial" w:hAnsi="Arial" w:cs="Arial"/>
+                <w:sz w:val="20"/>
+                <w:szCs w:val="20"/>
+              </w:rPr>
+              <w:t>Incremento 7</w:t>
+            </w:r>
           </w:p>
         </w:tc>
         <w:tc>
@@ -14968,6 +15326,14 @@
                 <w:szCs w:val="20"/>
               </w:rPr>
             </w:pPr>
+            <w:r>
+              <w:rPr>
+                <w:rFonts w:ascii="Arial" w:eastAsia="Arial" w:hAnsi="Arial" w:cs="Arial"/>
+                <w:sz w:val="20"/>
+                <w:szCs w:val="20"/>
+              </w:rPr>
+              <w:t>Melhorias solicitadas da entrega anterior.</w:t>
+            </w:r>
           </w:p>
         </w:tc>
         <w:tc>
@@ -15308,6 +15674,15 @@
                 <w:szCs w:val="20"/>
               </w:rPr>
               <w:t> </w:t>
+            </w:r>
+            <w:r>
+              <w:rPr>
+                <w:rFonts w:ascii="Arial" w:hAnsi="Arial" w:cs="Arial"/>
+                <w:color w:val="4472C4" w:themeColor="accent5"/>
+                <w:sz w:val="20"/>
+                <w:szCs w:val="20"/>
+              </w:rPr>
+              <w:t>P</w:t>
             </w:r>
           </w:p>
         </w:tc>
@@ -15901,6 +16276,15 @@
               </w:rPr>
               <w:t> </w:t>
             </w:r>
+            <w:r>
+              <w:rPr>
+                <w:rFonts w:ascii="Arial" w:hAnsi="Arial" w:cs="Arial"/>
+                <w:color w:val="70AD47" w:themeColor="accent6"/>
+                <w:sz w:val="20"/>
+                <w:szCs w:val="20"/>
+              </w:rPr>
+              <w:t>R</w:t>
+            </w:r>
           </w:p>
         </w:tc>
         <w:tc>
@@ -16494,17 +16878,7 @@
                 <w:sz w:val="20"/>
                 <w:szCs w:val="20"/>
               </w:rPr>
-              <w:t> </w:t>
-            </w:r>
-            <w:r>
-              <w:rPr>
-                <w:rFonts w:ascii="Arial" w:hAnsi="Arial" w:cs="Arial"/>
-                <w:b/>
-                <w:color w:val="0070C0"/>
-                <w:sz w:val="20"/>
-                <w:szCs w:val="20"/>
-              </w:rPr>
-              <w:t>P</w:t>
+              <w:t> P</w:t>
             </w:r>
           </w:p>
         </w:tc>
@@ -17066,6 +17440,15 @@
                 <w:szCs w:val="20"/>
               </w:rPr>
               <w:t> </w:t>
+            </w:r>
+            <w:r>
+              <w:rPr>
+                <w:rFonts w:ascii="Arial" w:hAnsi="Arial" w:cs="Arial"/>
+                <w:color w:val="70AD47" w:themeColor="accent6"/>
+                <w:sz w:val="20"/>
+                <w:szCs w:val="20"/>
+              </w:rPr>
+              <w:t>R</w:t>
             </w:r>
           </w:p>
         </w:tc>
@@ -17174,8 +17557,8 @@
       </w:pPr>
     </w:p>
     <w:sectPr>
-      <w:headerReference w:type="default" r:id="rId6"/>
-      <w:footerReference w:type="default" r:id="rId7"/>
+      <w:headerReference w:type="default" r:id="rId7"/>
+      <w:footerReference w:type="default" r:id="rId8"/>
       <w:pgSz w:w="16838" w:h="11906" w:orient="landscape"/>
       <w:pgMar w:top="1701" w:right="1417" w:bottom="1701" w:left="1417" w:header="708" w:footer="708" w:gutter="0"/>
       <w:cols w:space="708"/>
@@ -17214,7 +17597,7 @@
 <w:ftr xmlns:wpc="http://schemas.microsoft.com/office/word/2010/wordprocessingCanvas" xmlns:cx="http://schemas.microsoft.com/office/drawing/2014/chartex" xmlns:cx1="http://schemas.microsoft.com/office/drawing/2015/9/8/chartex" xmlns:cx2="http://schemas.microsoft.com/office/drawing/2015/10/21/chartex" xmlns:cx3="http://schemas.microsoft.com/office/drawing/2016/5/9/chartex" xmlns:cx4="http://schemas.microsoft.com/office/drawing/2016/5/10/chartex" xmlns:cx5="http://schemas.microsoft.com/office/drawing/2016/5/11/chartex" xmlns:cx6="http://schemas.microsoft.com/office/drawing/2016/5/12/chartex" xmlns:cx7="http://schemas.microsoft.com/office/drawing/2016/5/13/chartex" xmlns:cx8="http://schemas.microsoft.com/office/drawing/2016/5/14/chartex" xmlns:mc="http://schemas.openxmlformats.org/markup-compatibility/2006" xmlns:aink="http://schemas.microsoft.com/office/drawing/2016/ink" xmlns:am3d="http://schemas.microsoft.com/office/drawing/2017/model3d" xmlns:o="urn:schemas-microsoft-com:office:office" xmlns:oel="http://schemas.microsoft.com/office/2019/extlst" xmlns:r="http://schemas.openxmlformats.org/officeDocument/2006/relationships" xmlns:m="http://schemas.openxmlformats.org/officeDocument/2006/math" xmlns:v="urn:schemas-microsoft-com:vml" xmlns:wp14="http://schemas.microsoft.com/office/word/2010/wordprocessingDrawing" xmlns:wp="http://schemas.openxmlformats.org/drawingml/2006/wordprocessingDrawing" xmlns:w10="urn:schemas-microsoft-com:office:word" xmlns:w="http://schemas.openxmlformats.org/wordprocessingml/2006/main" xmlns:w14="http://schemas.microsoft.com/office/word/2010/wordml" xmlns:w15="http://schemas.microsoft.com/office/word/2012/wordml" xmlns:w16cex="http://schemas.microsoft.com/office/word/2018/wordml/cex" xmlns:w16cid="http://schemas.microsoft.com/office/word/2016/wordml/cid" xmlns:w16="http://schemas.microsoft.com/office/word/2018/wordml" xmlns:w16du="http://schemas.microsoft.com/office/word/2023/wordml/word16du" xmlns:w16sdtdh="http://schemas.microsoft.com/office/word/2020/wordml/sdtdatahash" xmlns:w16sdtfl="http://schemas.microsoft.com/office/word/2024/wordml/sdtformatlock" xmlns:w16se="http://schemas.microsoft.com/office/word/2015/wordml/symex" xmlns:wpg="http://schemas.microsoft.com/office/word/2010/wordprocessingGroup" xmlns:wpi="http://schemas.microsoft.com/office/word/2010/wordprocessingInk" xmlns:wne="http://schemas.microsoft.com/office/word/2006/wordml" xmlns:wps="http://schemas.microsoft.com/office/word/2010/wordprocessingShape" mc:Ignorable="w14 w15 w16se w16cid w16 w16cex w16sdtdh w16sdtfl w16du wp14">
   <w:p>
     <w:pPr>
-      <w:pStyle w:val="Footer"/>
+      <w:pStyle w:val="Rodap"/>
       <w:jc w:val="center"/>
       <w:rPr>
         <w:rFonts w:ascii="Arial" w:hAnsi="Arial" w:cs="Arial"/>
@@ -17353,7 +17736,7 @@
 <w:hdr xmlns:wpc="http://schemas.microsoft.com/office/word/2010/wordprocessingCanvas" xmlns:cx="http://schemas.microsoft.com/office/drawing/2014/chartex" xmlns:cx1="http://schemas.microsoft.com/office/drawing/2015/9/8/chartex" xmlns:cx2="http://schemas.microsoft.com/office/drawing/2015/10/21/chartex" xmlns:cx3="http://schemas.microsoft.com/office/drawing/2016/5/9/chartex" xmlns:cx4="http://schemas.microsoft.com/office/drawing/2016/5/10/chartex" xmlns:cx5="http://schemas.microsoft.com/office/drawing/2016/5/11/chartex" xmlns:cx6="http://schemas.microsoft.com/office/drawing/2016/5/12/chartex" xmlns:cx7="http://schemas.microsoft.com/office/drawing/2016/5/13/chartex" xmlns:cx8="http://schemas.microsoft.com/office/drawing/2016/5/14/chartex" xmlns:mc="http://schemas.openxmlformats.org/markup-compatibility/2006" xmlns:aink="http://schemas.microsoft.com/office/drawing/2016/ink" xmlns:am3d="http://schemas.microsoft.com/office/drawing/2017/model3d" xmlns:o="urn:schemas-microsoft-com:office:office" xmlns:oel="http://schemas.microsoft.com/office/2019/extlst" xmlns:r="http://schemas.openxmlformats.org/officeDocument/2006/relationships" xmlns:m="http://schemas.openxmlformats.org/officeDocument/2006/math" xmlns:v="urn:schemas-microsoft-com:vml" xmlns:wp14="http://schemas.microsoft.com/office/word/2010/wordprocessingDrawing" xmlns:wp="http://schemas.openxmlformats.org/drawingml/2006/wordprocessingDrawing" xmlns:w10="urn:schemas-microsoft-com:office:word" xmlns:w="http://schemas.openxmlformats.org/wordprocessingml/2006/main" xmlns:w14="http://schemas.microsoft.com/office/word/2010/wordml" xmlns:w15="http://schemas.microsoft.com/office/word/2012/wordml" xmlns:w16cex="http://schemas.microsoft.com/office/word/2018/wordml/cex" xmlns:w16cid="http://schemas.microsoft.com/office/word/2016/wordml/cid" xmlns:w16="http://schemas.microsoft.com/office/word/2018/wordml" xmlns:w16du="http://schemas.microsoft.com/office/word/2023/wordml/word16du" xmlns:w16sdtdh="http://schemas.microsoft.com/office/word/2020/wordml/sdtdatahash" xmlns:w16sdtfl="http://schemas.microsoft.com/office/word/2024/wordml/sdtformatlock" xmlns:w16se="http://schemas.microsoft.com/office/word/2015/wordml/symex" xmlns:wpg="http://schemas.microsoft.com/office/word/2010/wordprocessingGroup" xmlns:wpi="http://schemas.microsoft.com/office/word/2010/wordprocessingInk" xmlns:wne="http://schemas.microsoft.com/office/word/2006/wordml" xmlns:wps="http://schemas.microsoft.com/office/word/2010/wordprocessingShape" mc:Ignorable="w14 w15 w16se w16cid w16 w16cex w16sdtdh w16sdtfl w16du wp14">
   <w:p>
     <w:pPr>
-      <w:pStyle w:val="Header"/>
+      <w:pStyle w:val="Cabealho"/>
       <w:jc w:val="center"/>
       <w:rPr>
         <w:rFonts w:ascii="Arial" w:hAnsi="Arial" w:cs="Arial"/>
@@ -17363,6 +17746,163 @@
     </w:pPr>
   </w:p>
 </w:hdr>
+</file>
+
+<file path=word/numbering.xml><?xml version="1.0" encoding="utf-8"?>
+<w:numbering xmlns:wpc="http://schemas.microsoft.com/office/word/2010/wordprocessingCanvas" xmlns:cx="http://schemas.microsoft.com/office/drawing/2014/chartex" xmlns:cx1="http://schemas.microsoft.com/office/drawing/2015/9/8/chartex" xmlns:cx2="http://schemas.microsoft.com/office/drawing/2015/10/21/chartex" xmlns:cx3="http://schemas.microsoft.com/office/drawing/2016/5/9/chartex" xmlns:cx4="http://schemas.microsoft.com/office/drawing/2016/5/10/chartex" xmlns:cx5="http://schemas.microsoft.com/office/drawing/2016/5/11/chartex" xmlns:cx6="http://schemas.microsoft.com/office/drawing/2016/5/12/chartex" xmlns:cx7="http://schemas.microsoft.com/office/drawing/2016/5/13/chartex" xmlns:cx8="http://schemas.microsoft.com/office/drawing/2016/5/14/chartex" xmlns:mc="http://schemas.openxmlformats.org/markup-compatibility/2006" xmlns:aink="http://schemas.microsoft.com/office/drawing/2016/ink" xmlns:am3d="http://schemas.microsoft.com/office/drawing/2017/model3d" xmlns:o="urn:schemas-microsoft-com:office:office" xmlns:oel="http://schemas.microsoft.com/office/2019/extlst" xmlns:r="http://schemas.openxmlformats.org/officeDocument/2006/relationships" xmlns:m="http://schemas.openxmlformats.org/officeDocument/2006/math" xmlns:v="urn:schemas-microsoft-com:vml" xmlns:wp14="http://schemas.microsoft.com/office/word/2010/wordprocessingDrawing" xmlns:wp="http://schemas.openxmlformats.org/drawingml/2006/wordprocessingDrawing" xmlns:w10="urn:schemas-microsoft-com:office:word" xmlns:w="http://schemas.openxmlformats.org/wordprocessingml/2006/main" xmlns:w14="http://schemas.microsoft.com/office/word/2010/wordml" xmlns:w15="http://schemas.microsoft.com/office/word/2012/wordml" xmlns:w16cex="http://schemas.microsoft.com/office/word/2018/wordml/cex" xmlns:w16cid="http://schemas.microsoft.com/office/word/2016/wordml/cid" xmlns:w16="http://schemas.microsoft.com/office/word/2018/wordml" xmlns:w16du="http://schemas.microsoft.com/office/word/2023/wordml/word16du" xmlns:w16sdtdh="http://schemas.microsoft.com/office/word/2020/wordml/sdtdatahash" xmlns:w16sdtfl="http://schemas.microsoft.com/office/word/2024/wordml/sdtformatlock" xmlns:w16se="http://schemas.microsoft.com/office/word/2015/wordml/symex" xmlns:wpg="http://schemas.microsoft.com/office/word/2010/wordprocessingGroup" xmlns:wpi="http://schemas.microsoft.com/office/word/2010/wordprocessingInk" xmlns:wne="http://schemas.microsoft.com/office/word/2006/wordml" xmlns:wps="http://schemas.microsoft.com/office/word/2010/wordprocessingShape" mc:Ignorable="w14 w15 w16se w16cid w16 w16cex w16sdtdh w16sdtfl w16du wp14">
+  <w:abstractNum w:abstractNumId="0" w15:restartNumberingAfterBreak="0">
+    <w:nsid w:val="7FA53FBE"/>
+    <w:multiLevelType w:val="multilevel"/>
+    <w:tmpl w:val="5B74D324"/>
+    <w:lvl w:ilvl="0">
+      <w:start w:val="1"/>
+      <w:numFmt w:val="bullet"/>
+      <w:lvlText w:val=""/>
+      <w:lvlJc w:val="left"/>
+      <w:pPr>
+        <w:tabs>
+          <w:tab w:val="num" w:pos="720"/>
+        </w:tabs>
+        <w:ind w:left="720" w:hanging="360"/>
+      </w:pPr>
+      <w:rPr>
+        <w:rFonts w:ascii="Symbol" w:hAnsi="Symbol" w:hint="default"/>
+        <w:sz w:val="20"/>
+      </w:rPr>
+    </w:lvl>
+    <w:lvl w:ilvl="1" w:tentative="1">
+      <w:start w:val="1"/>
+      <w:numFmt w:val="bullet"/>
+      <w:lvlText w:val="o"/>
+      <w:lvlJc w:val="left"/>
+      <w:pPr>
+        <w:tabs>
+          <w:tab w:val="num" w:pos="1440"/>
+        </w:tabs>
+        <w:ind w:left="1440" w:hanging="360"/>
+      </w:pPr>
+      <w:rPr>
+        <w:rFonts w:ascii="Courier New" w:hAnsi="Courier New" w:hint="default"/>
+        <w:sz w:val="20"/>
+      </w:rPr>
+    </w:lvl>
+    <w:lvl w:ilvl="2" w:tentative="1">
+      <w:start w:val="1"/>
+      <w:numFmt w:val="bullet"/>
+      <w:lvlText w:val=""/>
+      <w:lvlJc w:val="left"/>
+      <w:pPr>
+        <w:tabs>
+          <w:tab w:val="num" w:pos="2160"/>
+        </w:tabs>
+        <w:ind w:left="2160" w:hanging="360"/>
+      </w:pPr>
+      <w:rPr>
+        <w:rFonts w:ascii="Wingdings" w:hAnsi="Wingdings" w:hint="default"/>
+        <w:sz w:val="20"/>
+      </w:rPr>
+    </w:lvl>
+    <w:lvl w:ilvl="3" w:tentative="1">
+      <w:start w:val="1"/>
+      <w:numFmt w:val="bullet"/>
+      <w:lvlText w:val=""/>
+      <w:lvlJc w:val="left"/>
+      <w:pPr>
+        <w:tabs>
+          <w:tab w:val="num" w:pos="2880"/>
+        </w:tabs>
+        <w:ind w:left="2880" w:hanging="360"/>
+      </w:pPr>
+      <w:rPr>
+        <w:rFonts w:ascii="Wingdings" w:hAnsi="Wingdings" w:hint="default"/>
+        <w:sz w:val="20"/>
+      </w:rPr>
+    </w:lvl>
+    <w:lvl w:ilvl="4" w:tentative="1">
+      <w:start w:val="1"/>
+      <w:numFmt w:val="bullet"/>
+      <w:lvlText w:val=""/>
+      <w:lvlJc w:val="left"/>
+      <w:pPr>
+        <w:tabs>
+          <w:tab w:val="num" w:pos="3600"/>
+        </w:tabs>
+        <w:ind w:left="3600" w:hanging="360"/>
+      </w:pPr>
+      <w:rPr>
+        <w:rFonts w:ascii="Wingdings" w:hAnsi="Wingdings" w:hint="default"/>
+        <w:sz w:val="20"/>
+      </w:rPr>
+    </w:lvl>
+    <w:lvl w:ilvl="5" w:tentative="1">
+      <w:start w:val="1"/>
+      <w:numFmt w:val="bullet"/>
+      <w:lvlText w:val=""/>
+      <w:lvlJc w:val="left"/>
+      <w:pPr>
+        <w:tabs>
+          <w:tab w:val="num" w:pos="4320"/>
+        </w:tabs>
+        <w:ind w:left="4320" w:hanging="360"/>
+      </w:pPr>
+      <w:rPr>
+        <w:rFonts w:ascii="Wingdings" w:hAnsi="Wingdings" w:hint="default"/>
+        <w:sz w:val="20"/>
+      </w:rPr>
+    </w:lvl>
+    <w:lvl w:ilvl="6" w:tentative="1">
+      <w:start w:val="1"/>
+      <w:numFmt w:val="bullet"/>
+      <w:lvlText w:val=""/>
+      <w:lvlJc w:val="left"/>
+      <w:pPr>
+        <w:tabs>
+          <w:tab w:val="num" w:pos="5040"/>
+        </w:tabs>
+        <w:ind w:left="5040" w:hanging="360"/>
+      </w:pPr>
+      <w:rPr>
+        <w:rFonts w:ascii="Wingdings" w:hAnsi="Wingdings" w:hint="default"/>
+        <w:sz w:val="20"/>
+      </w:rPr>
+    </w:lvl>
+    <w:lvl w:ilvl="7" w:tentative="1">
+      <w:start w:val="1"/>
+      <w:numFmt w:val="bullet"/>
+      <w:lvlText w:val=""/>
+      <w:lvlJc w:val="left"/>
+      <w:pPr>
+        <w:tabs>
+          <w:tab w:val="num" w:pos="5760"/>
+        </w:tabs>
+        <w:ind w:left="5760" w:hanging="360"/>
+      </w:pPr>
+      <w:rPr>
+        <w:rFonts w:ascii="Wingdings" w:hAnsi="Wingdings" w:hint="default"/>
+        <w:sz w:val="20"/>
+      </w:rPr>
+    </w:lvl>
+    <w:lvl w:ilvl="8" w:tentative="1">
+      <w:start w:val="1"/>
+      <w:numFmt w:val="bullet"/>
+      <w:lvlText w:val=""/>
+      <w:lvlJc w:val="left"/>
+      <w:pPr>
+        <w:tabs>
+          <w:tab w:val="num" w:pos="6480"/>
+        </w:tabs>
+        <w:ind w:left="6480" w:hanging="360"/>
+      </w:pPr>
+      <w:rPr>
+        <w:rFonts w:ascii="Wingdings" w:hAnsi="Wingdings" w:hint="default"/>
+        <w:sz w:val="20"/>
+      </w:rPr>
+    </w:lvl>
+  </w:abstractNum>
+  <w:num w:numId="1" w16cid:durableId="1343388314">
+    <w:abstractNumId w:val="0"/>
+  </w:num>
+</w:numbering>
 </file>
 
 <file path=word/styles.xml><?xml version="1.0" encoding="utf-8"?>
@@ -17771,11 +18311,11 @@
       <w:rFonts w:ascii="Calibri" w:eastAsia="Calibri" w:hAnsi="Calibri" w:cs="Calibri"/>
     </w:rPr>
   </w:style>
-  <w:style w:type="paragraph" w:styleId="Heading1">
+  <w:style w:type="paragraph" w:styleId="Ttulo1">
     <w:name w:val="heading 1"/>
     <w:basedOn w:val="Normal"/>
     <w:next w:val="Normal"/>
-    <w:link w:val="Heading1Char"/>
+    <w:link w:val="Ttulo1Char"/>
     <w:uiPriority w:val="9"/>
     <w:qFormat/>
     <w:rsid w:val="004B70AF"/>
@@ -17794,13 +18334,35 @@
       <w:szCs w:val="28"/>
     </w:rPr>
   </w:style>
-  <w:style w:type="character" w:default="1" w:styleId="DefaultParagraphFont">
+  <w:style w:type="paragraph" w:styleId="Ttulo2">
+    <w:name w:val="heading 2"/>
+    <w:basedOn w:val="Normal"/>
+    <w:next w:val="Normal"/>
+    <w:link w:val="Ttulo2Char"/>
+    <w:uiPriority w:val="9"/>
+    <w:semiHidden/>
+    <w:unhideWhenUsed/>
+    <w:qFormat/>
+    <w:rsid w:val="00434DEB"/>
+    <w:pPr>
+      <w:keepNext/>
+      <w:keepLines/>
+      <w:spacing w:before="40" w:after="0"/>
+      <w:outlineLvl w:val="1"/>
+    </w:pPr>
+    <w:rPr>
+      <w:rFonts w:asciiTheme="majorHAnsi" w:eastAsiaTheme="majorEastAsia" w:hAnsiTheme="majorHAnsi" w:cstheme="majorBidi"/>
+      <w:color w:val="2E74B5" w:themeColor="accent1" w:themeShade="BF"/>
+      <w:sz w:val="26"/>
+      <w:szCs w:val="26"/>
+    </w:rPr>
+  </w:style>
+  <w:style w:type="character" w:default="1" w:styleId="Fontepargpadro">
     <w:name w:val="Default Paragraph Font"/>
     <w:uiPriority w:val="1"/>
-    <w:semiHidden/>
     <w:unhideWhenUsed/>
   </w:style>
-  <w:style w:type="table" w:default="1" w:styleId="TableNormal">
+  <w:style w:type="table" w:default="1" w:styleId="Tabelanormal">
     <w:name w:val="Normal Table"/>
     <w:uiPriority w:val="99"/>
     <w:semiHidden/>
@@ -17815,16 +18377,16 @@
       </w:tblCellMar>
     </w:tblPr>
   </w:style>
-  <w:style w:type="numbering" w:default="1" w:styleId="NoList">
+  <w:style w:type="numbering" w:default="1" w:styleId="Semlista">
     <w:name w:val="No List"/>
     <w:uiPriority w:val="99"/>
     <w:semiHidden/>
     <w:unhideWhenUsed/>
   </w:style>
-  <w:style w:type="character" w:customStyle="1" w:styleId="Heading1Char">
-    <w:name w:val="Heading 1 Char"/>
-    <w:basedOn w:val="DefaultParagraphFont"/>
-    <w:link w:val="Heading1"/>
+  <w:style w:type="character" w:customStyle="1" w:styleId="Ttulo1Char">
+    <w:name w:val="Título 1 Char"/>
+    <w:basedOn w:val="Fontepargpadro"/>
+    <w:link w:val="Ttulo1"/>
     <w:uiPriority w:val="9"/>
     <w:rsid w:val="004B70AF"/>
     <w:rPr>
@@ -17836,10 +18398,10 @@
       <w:szCs w:val="28"/>
     </w:rPr>
   </w:style>
-  <w:style w:type="paragraph" w:styleId="Header">
+  <w:style w:type="paragraph" w:styleId="Cabealho">
     <w:name w:val="header"/>
     <w:basedOn w:val="Normal"/>
-    <w:link w:val="HeaderChar"/>
+    <w:link w:val="CabealhoChar"/>
     <w:uiPriority w:val="99"/>
     <w:unhideWhenUsed/>
     <w:rsid w:val="008B21D8"/>
@@ -17851,20 +18413,20 @@
       <w:spacing w:after="0" w:line="240" w:lineRule="auto"/>
     </w:pPr>
   </w:style>
-  <w:style w:type="character" w:customStyle="1" w:styleId="HeaderChar">
-    <w:name w:val="Header Char"/>
-    <w:basedOn w:val="DefaultParagraphFont"/>
-    <w:link w:val="Header"/>
+  <w:style w:type="character" w:customStyle="1" w:styleId="CabealhoChar">
+    <w:name w:val="Cabeçalho Char"/>
+    <w:basedOn w:val="Fontepargpadro"/>
+    <w:link w:val="Cabealho"/>
     <w:uiPriority w:val="99"/>
     <w:rsid w:val="008B21D8"/>
     <w:rPr>
       <w:rFonts w:ascii="Calibri" w:eastAsia="Calibri" w:hAnsi="Calibri" w:cs="Calibri"/>
     </w:rPr>
   </w:style>
-  <w:style w:type="paragraph" w:styleId="Footer">
+  <w:style w:type="paragraph" w:styleId="Rodap">
     <w:name w:val="footer"/>
     <w:basedOn w:val="Normal"/>
-    <w:link w:val="FooterChar"/>
+    <w:link w:val="RodapChar"/>
     <w:uiPriority w:val="99"/>
     <w:unhideWhenUsed/>
     <w:rsid w:val="008B21D8"/>
@@ -17876,14 +18438,28 @@
       <w:spacing w:after="0" w:line="240" w:lineRule="auto"/>
     </w:pPr>
   </w:style>
-  <w:style w:type="character" w:customStyle="1" w:styleId="FooterChar">
-    <w:name w:val="Footer Char"/>
-    <w:basedOn w:val="DefaultParagraphFont"/>
-    <w:link w:val="Footer"/>
+  <w:style w:type="character" w:customStyle="1" w:styleId="RodapChar">
+    <w:name w:val="Rodapé Char"/>
+    <w:basedOn w:val="Fontepargpadro"/>
+    <w:link w:val="Rodap"/>
     <w:uiPriority w:val="99"/>
     <w:rsid w:val="008B21D8"/>
     <w:rPr>
       <w:rFonts w:ascii="Calibri" w:eastAsia="Calibri" w:hAnsi="Calibri" w:cs="Calibri"/>
+    </w:rPr>
+  </w:style>
+  <w:style w:type="character" w:customStyle="1" w:styleId="Ttulo2Char">
+    <w:name w:val="Título 2 Char"/>
+    <w:basedOn w:val="Fontepargpadro"/>
+    <w:link w:val="Ttulo2"/>
+    <w:uiPriority w:val="9"/>
+    <w:semiHidden/>
+    <w:rsid w:val="00434DEB"/>
+    <w:rPr>
+      <w:rFonts w:asciiTheme="majorHAnsi" w:eastAsiaTheme="majorEastAsia" w:hAnsiTheme="majorHAnsi" w:cstheme="majorBidi"/>
+      <w:color w:val="2E74B5" w:themeColor="accent1" w:themeShade="BF"/>
+      <w:sz w:val="26"/>
+      <w:szCs w:val="26"/>
     </w:rPr>
   </w:style>
 </w:styles>

</xml_diff>